<commit_message>
Update IoT requirements and test results
</commit_message>
<xml_diff>
--- a/iot/artifacts/meeting1/Requirements.docx
+++ b/iot/artifacts/meeting1/Requirements.docx
@@ -924,6 +924,7 @@
           <w:lang w:val="sv-SE"/>
         </w:rPr>
       </w:pPr>
+      <w:proofErr w:type="spellStart"/>
       <w:r>
         <w:rPr>
           <w:rFonts w:ascii="Arial" w:eastAsia="Arial" w:hAnsi="Arial" w:cs="Arial"/>
@@ -933,8 +934,33 @@
           <w:szCs w:val="32"/>
           <w:lang w:val="sv-SE"/>
         </w:rPr>
-        <w:t>SmartHouse – IoT</w:t>
-      </w:r>
+        <w:t>SmartHouse</w:t>
+      </w:r>
+      <w:proofErr w:type="spellEnd"/>
+      <w:r>
+        <w:rPr>
+          <w:rFonts w:ascii="Arial" w:eastAsia="Arial" w:hAnsi="Arial" w:cs="Arial"/>
+          <w:b/>
+          <w:bCs/>
+          <w:sz w:val="32"/>
+          <w:szCs w:val="32"/>
+          <w:lang w:val="sv-SE"/>
+        </w:rPr>
+        <w:t xml:space="preserve"> – </w:t>
+      </w:r>
+      <w:proofErr w:type="spellStart"/>
+      <w:r>
+        <w:rPr>
+          <w:rFonts w:ascii="Arial" w:eastAsia="Arial" w:hAnsi="Arial" w:cs="Arial"/>
+          <w:b/>
+          <w:bCs/>
+          <w:sz w:val="32"/>
+          <w:szCs w:val="32"/>
+          <w:lang w:val="sv-SE"/>
+        </w:rPr>
+        <w:t>IoT</w:t>
+      </w:r>
+      <w:proofErr w:type="spellEnd"/>
     </w:p>
     <w:p/>
     <w:p>
@@ -1205,7 +1231,303 @@
                 <w:sz w:val="20"/>
                 <w:szCs w:val="20"/>
               </w:rPr>
-              <w:t>Created the initial requirements for the SmartHouse IoT subsystem based on the current project specification.</w:t>
+              <w:t xml:space="preserve">Created the initial requirements for the </w:t>
+            </w:r>
+            <w:proofErr w:type="spellStart"/>
+            <w:r>
+              <w:rPr>
+                <w:color w:val="000000"/>
+                <w:sz w:val="20"/>
+                <w:szCs w:val="20"/>
+              </w:rPr>
+              <w:t>SmartHouse</w:t>
+            </w:r>
+            <w:proofErr w:type="spellEnd"/>
+            <w:r>
+              <w:rPr>
+                <w:color w:val="000000"/>
+                <w:sz w:val="20"/>
+                <w:szCs w:val="20"/>
+              </w:rPr>
+              <w:t xml:space="preserve"> IoT subsystem based on the current project specification.</w:t>
+            </w:r>
+          </w:p>
+        </w:tc>
+        <w:tc>
+          <w:tcPr>
+            <w:tcW w:w="2415" w:type="dxa"/>
+          </w:tcPr>
+          <w:p>
+            <w:pPr>
+              <w:keepLines/>
+              <w:widowControl w:val="0"/>
+              <w:pBdr>
+                <w:top w:val="nil"/>
+                <w:left w:val="nil"/>
+                <w:bottom w:val="nil"/>
+                <w:right w:val="nil"/>
+                <w:between w:val="nil"/>
+              </w:pBdr>
+              <w:spacing w:after="120"/>
+              <w:rPr>
+                <w:color w:val="000000"/>
+                <w:sz w:val="20"/>
+                <w:szCs w:val="20"/>
+              </w:rPr>
+            </w:pPr>
+            <w:r>
+              <w:rPr>
+                <w:color w:val="000000"/>
+                <w:sz w:val="20"/>
+                <w:szCs w:val="20"/>
+              </w:rPr>
+              <w:t>Ali Daoud</w:t>
+            </w:r>
+          </w:p>
+        </w:tc>
+      </w:tr>
+      <w:tr>
+        <w:tc>
+          <w:tcPr>
+            <w:tcW w:w="2310" w:type="dxa"/>
+          </w:tcPr>
+          <w:p>
+            <w:pPr>
+              <w:keepLines/>
+              <w:widowControl w:val="0"/>
+              <w:pBdr>
+                <w:top w:val="nil"/>
+                <w:left w:val="nil"/>
+                <w:bottom w:val="nil"/>
+                <w:right w:val="nil"/>
+                <w:between w:val="nil"/>
+              </w:pBdr>
+              <w:spacing w:after="120"/>
+              <w:rPr>
+                <w:color w:val="000000"/>
+                <w:sz w:val="20"/>
+                <w:szCs w:val="20"/>
+              </w:rPr>
+            </w:pPr>
+            <w:r>
+              <w:rPr>
+                <w:color w:val="000000"/>
+                <w:sz w:val="20"/>
+                <w:szCs w:val="20"/>
+              </w:rPr>
+              <w:t>2026-08-01</w:t>
+            </w:r>
+          </w:p>
+        </w:tc>
+        <w:tc>
+          <w:tcPr>
+            <w:tcW w:w="1051" w:type="dxa"/>
+          </w:tcPr>
+          <w:p>
+            <w:pPr>
+              <w:keepLines/>
+              <w:widowControl w:val="0"/>
+              <w:pBdr>
+                <w:top w:val="nil"/>
+                <w:left w:val="nil"/>
+                <w:bottom w:val="nil"/>
+                <w:right w:val="nil"/>
+                <w:between w:val="nil"/>
+              </w:pBdr>
+              <w:spacing w:after="120"/>
+              <w:rPr>
+                <w:color w:val="000000"/>
+                <w:sz w:val="20"/>
+                <w:szCs w:val="20"/>
+              </w:rPr>
+            </w:pPr>
+            <w:r>
+              <w:rPr>
+                <w:color w:val="000000"/>
+                <w:sz w:val="20"/>
+                <w:szCs w:val="20"/>
+              </w:rPr>
+              <w:t>1.1</w:t>
+            </w:r>
+          </w:p>
+        </w:tc>
+        <w:tc>
+          <w:tcPr>
+            <w:tcW w:w="3749" w:type="dxa"/>
+          </w:tcPr>
+          <w:p>
+            <w:pPr>
+              <w:keepLines/>
+              <w:widowControl w:val="0"/>
+              <w:pBdr>
+                <w:top w:val="nil"/>
+                <w:left w:val="nil"/>
+                <w:bottom w:val="nil"/>
+                <w:right w:val="nil"/>
+                <w:between w:val="nil"/>
+              </w:pBdr>
+              <w:spacing w:after="120"/>
+              <w:rPr>
+                <w:color w:val="000000"/>
+                <w:sz w:val="20"/>
+                <w:szCs w:val="20"/>
+              </w:rPr>
+            </w:pPr>
+            <w:proofErr w:type="spellStart"/>
+            <w:r>
+              <w:rPr>
+                <w:color w:val="000000"/>
+                <w:sz w:val="20"/>
+                <w:szCs w:val="20"/>
+              </w:rPr>
+              <w:t>pdated</w:t>
+            </w:r>
+            <w:proofErr w:type="spellEnd"/>
+            <w:r>
+              <w:rPr>
+                <w:color w:val="000000"/>
+                <w:sz w:val="20"/>
+                <w:szCs w:val="20"/>
+              </w:rPr>
+              <w:t xml:space="preserve"> requirements progress</w:t>
+            </w:r>
+          </w:p>
+        </w:tc>
+        <w:tc>
+          <w:tcPr>
+            <w:tcW w:w="2415" w:type="dxa"/>
+          </w:tcPr>
+          <w:p>
+            <w:pPr>
+              <w:keepLines/>
+              <w:widowControl w:val="0"/>
+              <w:pBdr>
+                <w:top w:val="nil"/>
+                <w:left w:val="nil"/>
+                <w:bottom w:val="nil"/>
+                <w:right w:val="nil"/>
+                <w:between w:val="nil"/>
+              </w:pBdr>
+              <w:spacing w:after="120"/>
+              <w:rPr>
+                <w:color w:val="000000"/>
+                <w:sz w:val="20"/>
+                <w:szCs w:val="20"/>
+              </w:rPr>
+            </w:pPr>
+            <w:r>
+              <w:rPr>
+                <w:color w:val="000000"/>
+                <w:sz w:val="20"/>
+                <w:szCs w:val="20"/>
+              </w:rPr>
+              <w:t>Ali Daoud</w:t>
+            </w:r>
+          </w:p>
+        </w:tc>
+      </w:tr>
+      <w:tr>
+        <w:tc>
+          <w:tcPr>
+            <w:tcW w:w="2310" w:type="dxa"/>
+          </w:tcPr>
+          <w:p>
+            <w:pPr>
+              <w:keepLines/>
+              <w:widowControl w:val="0"/>
+              <w:pBdr>
+                <w:top w:val="nil"/>
+                <w:left w:val="nil"/>
+                <w:bottom w:val="nil"/>
+                <w:right w:val="nil"/>
+                <w:between w:val="nil"/>
+              </w:pBdr>
+              <w:spacing w:after="120"/>
+              <w:rPr>
+                <w:color w:val="000000"/>
+                <w:sz w:val="20"/>
+                <w:szCs w:val="20"/>
+              </w:rPr>
+            </w:pPr>
+            <w:r>
+              <w:rPr>
+                <w:color w:val="000000"/>
+                <w:sz w:val="20"/>
+                <w:szCs w:val="20"/>
+              </w:rPr>
+              <w:t>2026-08-14</w:t>
+            </w:r>
+          </w:p>
+        </w:tc>
+        <w:tc>
+          <w:tcPr>
+            <w:tcW w:w="1051" w:type="dxa"/>
+          </w:tcPr>
+          <w:p>
+            <w:pPr>
+              <w:keepLines/>
+              <w:widowControl w:val="0"/>
+              <w:pBdr>
+                <w:top w:val="nil"/>
+                <w:left w:val="nil"/>
+                <w:bottom w:val="nil"/>
+                <w:right w:val="nil"/>
+                <w:between w:val="nil"/>
+              </w:pBdr>
+              <w:spacing w:after="120"/>
+              <w:rPr>
+                <w:color w:val="000000"/>
+                <w:sz w:val="20"/>
+                <w:szCs w:val="20"/>
+              </w:rPr>
+            </w:pPr>
+            <w:r>
+              <w:rPr>
+                <w:color w:val="000000"/>
+                <w:sz w:val="20"/>
+                <w:szCs w:val="20"/>
+              </w:rPr>
+              <w:t>1.</w:t>
+            </w:r>
+            <w:r>
+              <w:rPr>
+                <w:color w:val="000000"/>
+                <w:sz w:val="20"/>
+                <w:szCs w:val="20"/>
+              </w:rPr>
+              <w:t>2</w:t>
+            </w:r>
+          </w:p>
+        </w:tc>
+        <w:tc>
+          <w:tcPr>
+            <w:tcW w:w="3749" w:type="dxa"/>
+          </w:tcPr>
+          <w:p>
+            <w:pPr>
+              <w:keepLines/>
+              <w:widowControl w:val="0"/>
+              <w:pBdr>
+                <w:top w:val="nil"/>
+                <w:left w:val="nil"/>
+                <w:bottom w:val="nil"/>
+                <w:right w:val="nil"/>
+                <w:between w:val="nil"/>
+              </w:pBdr>
+              <w:spacing w:after="120"/>
+              <w:rPr>
+                <w:color w:val="000000"/>
+                <w:sz w:val="20"/>
+                <w:szCs w:val="20"/>
+              </w:rPr>
+            </w:pPr>
+            <w:r>
+              <w:rPr>
+                <w:color w:val="000000"/>
+                <w:sz w:val="20"/>
+                <w:szCs w:val="20"/>
+              </w:rPr>
+              <w:t>Updated progress after successful mock backend simulation</w:t>
             </w:r>
           </w:p>
         </w:tc>
@@ -1299,16 +1621,40 @@
                 <w:lang w:val="sv-SE"/>
               </w:rPr>
             </w:pPr>
-            <w:r>
-              <w:rPr>
-                <w:b w:val="0"/>
-                <w:bCs w:val="0"/>
-                <w:sz w:val="22"/>
-                <w:szCs w:val="22"/>
-                <w:lang w:val="sv-SE"/>
-              </w:rPr>
-              <w:t>Requirement Name</w:t>
-            </w:r>
+            <w:proofErr w:type="spellStart"/>
+            <w:r>
+              <w:rPr>
+                <w:b w:val="0"/>
+                <w:bCs w:val="0"/>
+                <w:sz w:val="22"/>
+                <w:szCs w:val="22"/>
+                <w:lang w:val="sv-SE"/>
+              </w:rPr>
+              <w:t>Requirement</w:t>
+            </w:r>
+            <w:proofErr w:type="spellEnd"/>
+            <w:r>
+              <w:rPr>
+                <w:b w:val="0"/>
+                <w:bCs w:val="0"/>
+                <w:sz w:val="22"/>
+                <w:szCs w:val="22"/>
+                <w:lang w:val="sv-SE"/>
+              </w:rPr>
+              <w:t xml:space="preserve"> </w:t>
+            </w:r>
+            <w:proofErr w:type="spellStart"/>
+            <w:r>
+              <w:rPr>
+                <w:b w:val="0"/>
+                <w:bCs w:val="0"/>
+                <w:sz w:val="22"/>
+                <w:szCs w:val="22"/>
+                <w:lang w:val="sv-SE"/>
+              </w:rPr>
+              <w:t>Name</w:t>
+            </w:r>
+            <w:proofErr w:type="spellEnd"/>
           </w:p>
         </w:tc>
         <w:tc>
@@ -1329,6 +1675,7 @@
                 <w:lang w:val="sv-SE"/>
               </w:rPr>
             </w:pPr>
+            <w:proofErr w:type="spellStart"/>
             <w:r>
               <w:rPr>
                 <w:b w:val="0"/>
@@ -1339,6 +1686,7 @@
               </w:rPr>
               <w:t>Priority</w:t>
             </w:r>
+            <w:proofErr w:type="spellEnd"/>
           </w:p>
         </w:tc>
         <w:tc>
@@ -1402,7 +1750,51 @@
                 <w:szCs w:val="22"/>
                 <w:lang w:val="sv-SE"/>
               </w:rPr>
-              <w:t>R1. Wokwi Device Simulation</w:t>
+              <w:t xml:space="preserve">R1. </w:t>
+            </w:r>
+            <w:proofErr w:type="spellStart"/>
+            <w:r>
+              <w:rPr>
+                <w:b w:val="0"/>
+                <w:bCs w:val="0"/>
+                <w:sz w:val="22"/>
+                <w:szCs w:val="22"/>
+                <w:lang w:val="sv-SE"/>
+              </w:rPr>
+              <w:t>Wokwi</w:t>
+            </w:r>
+            <w:proofErr w:type="spellEnd"/>
+            <w:r>
+              <w:rPr>
+                <w:b w:val="0"/>
+                <w:bCs w:val="0"/>
+                <w:sz w:val="22"/>
+                <w:szCs w:val="22"/>
+                <w:lang w:val="sv-SE"/>
+              </w:rPr>
+              <w:t xml:space="preserve"> </w:t>
+            </w:r>
+            <w:proofErr w:type="spellStart"/>
+            <w:r>
+              <w:rPr>
+                <w:b w:val="0"/>
+                <w:bCs w:val="0"/>
+                <w:sz w:val="22"/>
+                <w:szCs w:val="22"/>
+                <w:lang w:val="sv-SE"/>
+              </w:rPr>
+              <w:t>Device</w:t>
+            </w:r>
+            <w:proofErr w:type="spellEnd"/>
+            <w:r>
+              <w:rPr>
+                <w:b w:val="0"/>
+                <w:bCs w:val="0"/>
+                <w:sz w:val="22"/>
+                <w:szCs w:val="22"/>
+                <w:lang w:val="sv-SE"/>
+              </w:rPr>
+              <w:t xml:space="preserve"> Simulation</w:t>
             </w:r>
           </w:p>
         </w:tc>
@@ -1424,6 +1816,7 @@
                 <w:lang w:val="sv-SE"/>
               </w:rPr>
             </w:pPr>
+            <w:proofErr w:type="spellStart"/>
             <w:r>
               <w:rPr>
                 <w:b w:val="0"/>
@@ -1434,6 +1827,7 @@
               </w:rPr>
               <w:t>Essential</w:t>
             </w:r>
+            <w:proofErr w:type="spellEnd"/>
           </w:p>
         </w:tc>
         <w:tc>
@@ -1529,6 +1923,7 @@
                 <w:lang w:val="sv-SE"/>
               </w:rPr>
             </w:pPr>
+            <w:proofErr w:type="spellStart"/>
             <w:r>
               <w:rPr>
                 <w:b w:val="0"/>
@@ -1539,6 +1934,7 @@
               </w:rPr>
               <w:t>Essential</w:t>
             </w:r>
+            <w:proofErr w:type="spellEnd"/>
           </w:p>
         </w:tc>
         <w:tc>
@@ -1612,8 +2008,43 @@
                 <w:szCs w:val="22"/>
                 <w:lang w:val="sv-SE"/>
               </w:rPr>
-              <w:t>R3. Device Registration</w:t>
-            </w:r>
+              <w:lastRenderedPageBreak/>
+              <w:t xml:space="preserve">R3. </w:t>
+            </w:r>
+            <w:proofErr w:type="spellStart"/>
+            <w:r>
+              <w:rPr>
+                <w:b w:val="0"/>
+                <w:bCs w:val="0"/>
+                <w:sz w:val="22"/>
+                <w:szCs w:val="22"/>
+                <w:lang w:val="sv-SE"/>
+              </w:rPr>
+              <w:t>Device</w:t>
+            </w:r>
+            <w:proofErr w:type="spellEnd"/>
+            <w:r>
+              <w:rPr>
+                <w:b w:val="0"/>
+                <w:bCs w:val="0"/>
+                <w:sz w:val="22"/>
+                <w:szCs w:val="22"/>
+                <w:lang w:val="sv-SE"/>
+              </w:rPr>
+              <w:t xml:space="preserve"> </w:t>
+            </w:r>
+            <w:proofErr w:type="spellStart"/>
+            <w:r>
+              <w:rPr>
+                <w:b w:val="0"/>
+                <w:bCs w:val="0"/>
+                <w:sz w:val="22"/>
+                <w:szCs w:val="22"/>
+                <w:lang w:val="sv-SE"/>
+              </w:rPr>
+              <w:t>Registration</w:t>
+            </w:r>
+            <w:proofErr w:type="spellEnd"/>
           </w:p>
         </w:tc>
         <w:tc>
@@ -1634,6 +2065,7 @@
                 <w:lang w:val="sv-SE"/>
               </w:rPr>
             </w:pPr>
+            <w:proofErr w:type="spellStart"/>
             <w:r>
               <w:rPr>
                 <w:b w:val="0"/>
@@ -1644,6 +2076,7 @@
               </w:rPr>
               <w:t>Essential</w:t>
             </w:r>
+            <w:proofErr w:type="spellEnd"/>
           </w:p>
         </w:tc>
         <w:tc>
@@ -1672,7 +2105,7 @@
                 <w:szCs w:val="22"/>
                 <w:lang w:val="sv-SE"/>
               </w:rPr>
-              <w:t>5</w:t>
+              <w:t>8</w:t>
             </w:r>
             <w:r>
               <w:rPr>
@@ -1717,8 +2150,64 @@
                 <w:szCs w:val="22"/>
                 <w:lang w:val="sv-SE"/>
               </w:rPr>
-              <w:t>R4. Device Secret Authentication</w:t>
-            </w:r>
+              <w:t xml:space="preserve">R4. </w:t>
+            </w:r>
+            <w:proofErr w:type="spellStart"/>
+            <w:r>
+              <w:rPr>
+                <w:b w:val="0"/>
+                <w:bCs w:val="0"/>
+                <w:sz w:val="22"/>
+                <w:szCs w:val="22"/>
+                <w:lang w:val="sv-SE"/>
+              </w:rPr>
+              <w:t>Device</w:t>
+            </w:r>
+            <w:proofErr w:type="spellEnd"/>
+            <w:r>
+              <w:rPr>
+                <w:b w:val="0"/>
+                <w:bCs w:val="0"/>
+                <w:sz w:val="22"/>
+                <w:szCs w:val="22"/>
+                <w:lang w:val="sv-SE"/>
+              </w:rPr>
+              <w:t xml:space="preserve"> </w:t>
+            </w:r>
+            <w:proofErr w:type="spellStart"/>
+            <w:r>
+              <w:rPr>
+                <w:b w:val="0"/>
+                <w:bCs w:val="0"/>
+                <w:sz w:val="22"/>
+                <w:szCs w:val="22"/>
+                <w:lang w:val="sv-SE"/>
+              </w:rPr>
+              <w:t>Secret</w:t>
+            </w:r>
+            <w:proofErr w:type="spellEnd"/>
+            <w:r>
+              <w:rPr>
+                <w:b w:val="0"/>
+                <w:bCs w:val="0"/>
+                <w:sz w:val="22"/>
+                <w:szCs w:val="22"/>
+                <w:lang w:val="sv-SE"/>
+              </w:rPr>
+              <w:t xml:space="preserve"> </w:t>
+            </w:r>
+            <w:proofErr w:type="spellStart"/>
+            <w:r>
+              <w:rPr>
+                <w:b w:val="0"/>
+                <w:bCs w:val="0"/>
+                <w:sz w:val="22"/>
+                <w:szCs w:val="22"/>
+                <w:lang w:val="sv-SE"/>
+              </w:rPr>
+              <w:t>Authentication</w:t>
+            </w:r>
+            <w:proofErr w:type="spellEnd"/>
           </w:p>
         </w:tc>
         <w:tc>
@@ -1739,6 +2228,7 @@
                 <w:lang w:val="sv-SE"/>
               </w:rPr>
             </w:pPr>
+            <w:proofErr w:type="spellStart"/>
             <w:r>
               <w:rPr>
                 <w:b w:val="0"/>
@@ -1749,6 +2239,7 @@
               </w:rPr>
               <w:t>Essential</w:t>
             </w:r>
+            <w:proofErr w:type="spellEnd"/>
           </w:p>
         </w:tc>
         <w:tc>
@@ -1777,7 +2268,7 @@
                 <w:szCs w:val="22"/>
                 <w:lang w:val="sv-SE"/>
               </w:rPr>
-              <w:t>5</w:t>
+              <w:t>8</w:t>
             </w:r>
             <w:r>
               <w:rPr>
@@ -1822,7 +2313,29 @@
                 <w:szCs w:val="22"/>
                 <w:lang w:val="sv-SE"/>
               </w:rPr>
-              <w:t>R5. Device Heartbeat</w:t>
+              <w:t xml:space="preserve">R5. </w:t>
+            </w:r>
+            <w:proofErr w:type="spellStart"/>
+            <w:r>
+              <w:rPr>
+                <w:b w:val="0"/>
+                <w:bCs w:val="0"/>
+                <w:sz w:val="22"/>
+                <w:szCs w:val="22"/>
+                <w:lang w:val="sv-SE"/>
+              </w:rPr>
+              <w:t>Device</w:t>
+            </w:r>
+            <w:proofErr w:type="spellEnd"/>
+            <w:r>
+              <w:rPr>
+                <w:b w:val="0"/>
+                <w:bCs w:val="0"/>
+                <w:sz w:val="22"/>
+                <w:szCs w:val="22"/>
+                <w:lang w:val="sv-SE"/>
+              </w:rPr>
+              <w:t xml:space="preserve"> Heartbeat</w:t>
             </w:r>
           </w:p>
         </w:tc>
@@ -1844,6 +2357,7 @@
                 <w:lang w:val="sv-SE"/>
               </w:rPr>
             </w:pPr>
+            <w:proofErr w:type="spellStart"/>
             <w:r>
               <w:rPr>
                 <w:b w:val="0"/>
@@ -1854,6 +2368,7 @@
               </w:rPr>
               <w:t>Essential</w:t>
             </w:r>
+            <w:proofErr w:type="spellEnd"/>
           </w:p>
         </w:tc>
         <w:tc>
@@ -1882,7 +2397,7 @@
                 <w:szCs w:val="22"/>
                 <w:lang w:val="sv-SE"/>
               </w:rPr>
-              <w:t>5</w:t>
+              <w:t>10</w:t>
             </w:r>
             <w:r>
               <w:rPr>
@@ -1927,8 +2442,29 @@
                 <w:szCs w:val="22"/>
                 <w:lang w:val="sv-SE"/>
               </w:rPr>
-              <w:lastRenderedPageBreak/>
-              <w:t>R6. Device State Management</w:t>
+              <w:t xml:space="preserve">R6. </w:t>
+            </w:r>
+            <w:proofErr w:type="spellStart"/>
+            <w:r>
+              <w:rPr>
+                <w:b w:val="0"/>
+                <w:bCs w:val="0"/>
+                <w:sz w:val="22"/>
+                <w:szCs w:val="22"/>
+                <w:lang w:val="sv-SE"/>
+              </w:rPr>
+              <w:t>Device</w:t>
+            </w:r>
+            <w:proofErr w:type="spellEnd"/>
+            <w:r>
+              <w:rPr>
+                <w:b w:val="0"/>
+                <w:bCs w:val="0"/>
+                <w:sz w:val="22"/>
+                <w:szCs w:val="22"/>
+                <w:lang w:val="sv-SE"/>
+              </w:rPr>
+              <w:t xml:space="preserve"> State Management</w:t>
             </w:r>
           </w:p>
         </w:tc>
@@ -1950,6 +2486,7 @@
                 <w:lang w:val="sv-SE"/>
               </w:rPr>
             </w:pPr>
+            <w:proofErr w:type="spellStart"/>
             <w:r>
               <w:rPr>
                 <w:b w:val="0"/>
@@ -1960,6 +2497,7 @@
               </w:rPr>
               <w:t>Essential</w:t>
             </w:r>
+            <w:proofErr w:type="spellEnd"/>
           </w:p>
         </w:tc>
         <w:tc>
@@ -2033,7 +2571,51 @@
                 <w:szCs w:val="22"/>
                 <w:lang w:val="sv-SE"/>
               </w:rPr>
-              <w:t>R7. Backend Command Handling</w:t>
+              <w:t xml:space="preserve">R7. </w:t>
+            </w:r>
+            <w:proofErr w:type="spellStart"/>
+            <w:r>
+              <w:rPr>
+                <w:b w:val="0"/>
+                <w:bCs w:val="0"/>
+                <w:sz w:val="22"/>
+                <w:szCs w:val="22"/>
+                <w:lang w:val="sv-SE"/>
+              </w:rPr>
+              <w:t>Backend</w:t>
+            </w:r>
+            <w:proofErr w:type="spellEnd"/>
+            <w:r>
+              <w:rPr>
+                <w:b w:val="0"/>
+                <w:bCs w:val="0"/>
+                <w:sz w:val="22"/>
+                <w:szCs w:val="22"/>
+                <w:lang w:val="sv-SE"/>
+              </w:rPr>
+              <w:t xml:space="preserve"> </w:t>
+            </w:r>
+            <w:proofErr w:type="spellStart"/>
+            <w:r>
+              <w:rPr>
+                <w:b w:val="0"/>
+                <w:bCs w:val="0"/>
+                <w:sz w:val="22"/>
+                <w:szCs w:val="22"/>
+                <w:lang w:val="sv-SE"/>
+              </w:rPr>
+              <w:t>Command</w:t>
+            </w:r>
+            <w:proofErr w:type="spellEnd"/>
+            <w:r>
+              <w:rPr>
+                <w:b w:val="0"/>
+                <w:bCs w:val="0"/>
+                <w:sz w:val="22"/>
+                <w:szCs w:val="22"/>
+                <w:lang w:val="sv-SE"/>
+              </w:rPr>
+              <w:t xml:space="preserve"> Handling</w:t>
             </w:r>
           </w:p>
         </w:tc>
@@ -2055,6 +2637,7 @@
                 <w:lang w:val="sv-SE"/>
               </w:rPr>
             </w:pPr>
+            <w:proofErr w:type="spellStart"/>
             <w:r>
               <w:rPr>
                 <w:b w:val="0"/>
@@ -2065,6 +2648,7 @@
               </w:rPr>
               <w:t>Essential</w:t>
             </w:r>
+            <w:proofErr w:type="spellEnd"/>
           </w:p>
         </w:tc>
         <w:tc>
@@ -2085,6 +2669,16 @@
                 <w:lang w:val="sv-SE"/>
               </w:rPr>
             </w:pPr>
+            <w:r>
+              <w:rPr>
+                <w:b w:val="0"/>
+                <w:bCs w:val="0"/>
+                <w:sz w:val="22"/>
+                <w:szCs w:val="22"/>
+                <w:lang w:val="sv-SE"/>
+              </w:rPr>
+              <w:t>10</w:t>
+            </w:r>
             <w:r>
               <w:rPr>
                 <w:b w:val="0"/>
@@ -2128,7 +2722,29 @@
                 <w:szCs w:val="22"/>
                 <w:lang w:val="sv-SE"/>
               </w:rPr>
-              <w:t>R8. Device State Reporting</w:t>
+              <w:t xml:space="preserve">R8. </w:t>
+            </w:r>
+            <w:proofErr w:type="spellStart"/>
+            <w:r>
+              <w:rPr>
+                <w:b w:val="0"/>
+                <w:bCs w:val="0"/>
+                <w:sz w:val="22"/>
+                <w:szCs w:val="22"/>
+                <w:lang w:val="sv-SE"/>
+              </w:rPr>
+              <w:t>Device</w:t>
+            </w:r>
+            <w:proofErr w:type="spellEnd"/>
+            <w:r>
+              <w:rPr>
+                <w:b w:val="0"/>
+                <w:bCs w:val="0"/>
+                <w:sz w:val="22"/>
+                <w:szCs w:val="22"/>
+                <w:lang w:val="sv-SE"/>
+              </w:rPr>
+              <w:t xml:space="preserve"> State Reporting</w:t>
             </w:r>
           </w:p>
         </w:tc>
@@ -2150,6 +2766,7 @@
                 <w:lang w:val="sv-SE"/>
               </w:rPr>
             </w:pPr>
+            <w:proofErr w:type="spellStart"/>
             <w:r>
               <w:rPr>
                 <w:b w:val="0"/>
@@ -2160,6 +2777,7 @@
               </w:rPr>
               <w:t>Essential</w:t>
             </w:r>
+            <w:proofErr w:type="spellEnd"/>
           </w:p>
         </w:tc>
         <w:tc>
@@ -2223,7 +2841,51 @@
                 <w:szCs w:val="22"/>
                 <w:lang w:val="sv-SE"/>
               </w:rPr>
-              <w:t>R9. Multiple Device Support</w:t>
+              <w:t xml:space="preserve">R9. </w:t>
+            </w:r>
+            <w:proofErr w:type="spellStart"/>
+            <w:r>
+              <w:rPr>
+                <w:b w:val="0"/>
+                <w:bCs w:val="0"/>
+                <w:sz w:val="22"/>
+                <w:szCs w:val="22"/>
+                <w:lang w:val="sv-SE"/>
+              </w:rPr>
+              <w:t>Multiple</w:t>
+            </w:r>
+            <w:proofErr w:type="spellEnd"/>
+            <w:r>
+              <w:rPr>
+                <w:b w:val="0"/>
+                <w:bCs w:val="0"/>
+                <w:sz w:val="22"/>
+                <w:szCs w:val="22"/>
+                <w:lang w:val="sv-SE"/>
+              </w:rPr>
+              <w:t xml:space="preserve"> </w:t>
+            </w:r>
+            <w:proofErr w:type="spellStart"/>
+            <w:r>
+              <w:rPr>
+                <w:b w:val="0"/>
+                <w:bCs w:val="0"/>
+                <w:sz w:val="22"/>
+                <w:szCs w:val="22"/>
+                <w:lang w:val="sv-SE"/>
+              </w:rPr>
+              <w:t>Device</w:t>
+            </w:r>
+            <w:proofErr w:type="spellEnd"/>
+            <w:r>
+              <w:rPr>
+                <w:b w:val="0"/>
+                <w:bCs w:val="0"/>
+                <w:sz w:val="22"/>
+                <w:szCs w:val="22"/>
+                <w:lang w:val="sv-SE"/>
+              </w:rPr>
+              <w:t xml:space="preserve"> Support</w:t>
             </w:r>
           </w:p>
         </w:tc>
@@ -2245,6 +2907,7 @@
                 <w:lang w:val="sv-SE"/>
               </w:rPr>
             </w:pPr>
+            <w:proofErr w:type="spellStart"/>
             <w:r>
               <w:rPr>
                 <w:b w:val="0"/>
@@ -2255,6 +2918,7 @@
               </w:rPr>
               <w:t>Essential</w:t>
             </w:r>
+            <w:proofErr w:type="spellEnd"/>
           </w:p>
         </w:tc>
         <w:tc>
@@ -2332,7 +2996,15 @@
       </w:pPr>
       <w:bookmarkStart w:id="4" w:name="_Toc236043815"/>
       <w:r>
-        <w:t>R1: Wokwi Device Simulation</w:t>
+        <w:t xml:space="preserve">R1: </w:t>
+      </w:r>
+      <w:proofErr w:type="spellStart"/>
+      <w:r>
+        <w:t>Wokwi</w:t>
+      </w:r>
+      <w:proofErr w:type="spellEnd"/>
+      <w:r>
+        <w:t xml:space="preserve"> Device Simulation</w:t>
       </w:r>
       <w:bookmarkEnd w:id="4"/>
     </w:p>
@@ -2348,7 +3020,23 @@
           <w:sz w:val="22"/>
           <w:szCs w:val="22"/>
         </w:rPr>
-        <w:t>The IoT subsystem shall use Wokwi and ESP32 to simulate smart-home devices without requiring physical hardware. The simulation shall include at least 10 logical devices using the device types supported by the backend.</w:t>
+        <w:t xml:space="preserve">The IoT subsystem shall use </w:t>
+      </w:r>
+      <w:proofErr w:type="spellStart"/>
+      <w:r>
+        <w:rPr>
+          <w:sz w:val="22"/>
+          <w:szCs w:val="22"/>
+        </w:rPr>
+        <w:t>Wokwi</w:t>
+      </w:r>
+      <w:proofErr w:type="spellEnd"/>
+      <w:r>
+        <w:rPr>
+          <w:sz w:val="22"/>
+          <w:szCs w:val="22"/>
+        </w:rPr>
+        <w:t xml:space="preserve"> and ESP32 to simulate smart-home devices without requiring physical hardware. The simulation shall include at least 10 logical devices using the device types supported by the backend.</w:t>
       </w:r>
     </w:p>
     <w:p>
@@ -2381,7 +3069,39 @@
           <w:sz w:val="22"/>
           <w:szCs w:val="22"/>
         </w:rPr>
-        <w:t xml:space="preserve">The ESP32 simulation shall connect to Wokwi Wi-Fi and communicate with the SmartHouse backend through HTTP requests. The backend base URL shall be configurable so that it can be updated if the </w:t>
+        <w:t xml:space="preserve">The ESP32 simulation shall connect to </w:t>
+      </w:r>
+      <w:proofErr w:type="spellStart"/>
+      <w:r>
+        <w:rPr>
+          <w:sz w:val="22"/>
+          <w:szCs w:val="22"/>
+        </w:rPr>
+        <w:t>Wokwi</w:t>
+      </w:r>
+      <w:proofErr w:type="spellEnd"/>
+      <w:r>
+        <w:rPr>
+          <w:sz w:val="22"/>
+          <w:szCs w:val="22"/>
+        </w:rPr>
+        <w:t xml:space="preserve"> Wi-Fi and communicate with the </w:t>
+      </w:r>
+      <w:proofErr w:type="spellStart"/>
+      <w:r>
+        <w:rPr>
+          <w:sz w:val="22"/>
+          <w:szCs w:val="22"/>
+        </w:rPr>
+        <w:t>SmartHouse</w:t>
+      </w:r>
+      <w:proofErr w:type="spellEnd"/>
+      <w:r>
+        <w:rPr>
+          <w:sz w:val="22"/>
+          <w:szCs w:val="22"/>
+        </w:rPr>
+        <w:t xml:space="preserve"> backend through HTTP requests. The backend base URL shall be configurable so that it can be updated if the </w:t>
       </w:r>
     </w:p>
     <w:p>
@@ -2396,7 +3116,23 @@
           <w:sz w:val="22"/>
           <w:szCs w:val="22"/>
         </w:rPr>
-        <w:t>public Ngrok address changes.</w:t>
+        <w:t xml:space="preserve">public </w:t>
+      </w:r>
+      <w:proofErr w:type="spellStart"/>
+      <w:r>
+        <w:rPr>
+          <w:sz w:val="22"/>
+          <w:szCs w:val="22"/>
+        </w:rPr>
+        <w:t>Ngrok</w:t>
+      </w:r>
+      <w:proofErr w:type="spellEnd"/>
+      <w:r>
+        <w:rPr>
+          <w:sz w:val="22"/>
+          <w:szCs w:val="22"/>
+        </w:rPr>
+        <w:t xml:space="preserve"> address changes.</w:t>
       </w:r>
     </w:p>
     <w:p>
@@ -2419,7 +3155,15 @@
     </w:p>
     <w:p>
       <w:r>
-        <w:t>Each simulated device shall register with the backend exactly once by sending a unique ID, device name, valid device type, and initial state to the /api/devices/register endpoint. The device shall store the secret returned by the backend.</w:t>
+        <w:t>Each simulated device shall register with the backend exactly once by sending a unique ID, device name, valid device type, and initial state to the /</w:t>
+      </w:r>
+      <w:proofErr w:type="spellStart"/>
+      <w:r>
+        <w:t>api</w:t>
+      </w:r>
+      <w:proofErr w:type="spellEnd"/>
+      <w:r>
+        <w:t>/devices/register endpoint. The device shall store the secret returned by the backend.</w:t>
       </w:r>
     </w:p>
     <w:p/>
@@ -2469,7 +3213,15 @@
         <w:spacing w:after="240"/>
       </w:pPr>
       <w:r>
-        <w:t>Each registered device shall send a heartbeat request to the /api/devices/heartbeat endpoint every 30 seconds. The request shall contain the device ID and secret so that the backend can determine whether the device is online or offline.</w:t>
+        <w:t>Each registered device shall send a heartbeat request to the /</w:t>
+      </w:r>
+      <w:proofErr w:type="spellStart"/>
+      <w:r>
+        <w:t>api</w:t>
+      </w:r>
+      <w:proofErr w:type="spellEnd"/>
+      <w:r>
+        <w:t>/devices/heartbeat endpoint every 30 seconds. The request shall contain the device ID and secret so that the backend can determine whether the device is online or offline.</w:t>
       </w:r>
     </w:p>
     <w:p>
@@ -2483,7 +3235,6 @@
       </w:pPr>
       <w:bookmarkStart w:id="9" w:name="_Toc236043820"/>
       <w:r>
-        <w:lastRenderedPageBreak/>
         <w:t>R6: Device State Management</w:t>
       </w:r>
       <w:bookmarkEnd w:id="9"/>
@@ -2512,18 +3263,17 @@
       <w:bookmarkEnd w:id="10"/>
     </w:p>
     <w:p>
-      <w:pPr>
-        <w:spacing w:after="240"/>
-      </w:pPr>
-      <w:r>
-        <w:t>The IoT subsystem shall receive commands from the backend and apply them to the correct simulated device. A command may turn a device on or off, change a value, adjust fan speed, or open and close a door or window. The final endpoint, JSON format, and communication method will be updated when the backend command documentation is provided.</w:t>
+      <w:r>
+        <w:t>The IoT subsystem shall retrieve desired device states from the backend and apply the received states to the corresponding simulated hardware.</w:t>
       </w:r>
     </w:p>
+    <w:p/>
     <w:p>
-      <w:pPr>
-        <w:spacing w:after="240"/>
-      </w:pPr>
+      <w:r>
+        <w:t>Implementation status: Implemented and successfully tested using simulated GET /devices/states responses. Desired states are received every 3 seconds and applied to the simulated hardware.</w:t>
+      </w:r>
     </w:p>
+    <w:p/>
     <w:p>
       <w:pPr>
         <w:pStyle w:val="Rubrik2"/>
@@ -2535,17 +3285,15 @@
       <w:bookmarkEnd w:id="11"/>
     </w:p>
     <w:p>
-      <w:pPr>
-        <w:spacing w:after="240"/>
-      </w:pPr>
-      <w:r>
-        <w:t>After executing a command or detecting a sensor change, the simulated device shall report its updated state to the backend. The final endpoint and JSON format will be added when the backend state-update documentation is provided.</w:t>
+      <w:r>
+        <w:t>The IoT subsystem shall report relevant sensor and device state changes to the backend.</w:t>
       </w:r>
     </w:p>
+    <w:p/>
     <w:p>
-      <w:pPr>
-        <w:spacing w:after="240"/>
-      </w:pPr>
+      <w:r>
+        <w:t>Implementation status: Not implemented because no backend endpoint for reporting sensor/device states is currently available.</w:t>
+      </w:r>
     </w:p>
     <w:p>
       <w:pPr>
@@ -2562,7 +3310,31 @@
         <w:spacing w:after="240"/>
       </w:pPr>
       <w:r>
-        <w:t>The IoT subsystem shall support at least 10 simulated smart-home devices. The devices may use the supported backend types: light, door, fan, coffee_machine, temperature_sensor, motion_sensor, alarm, and window. Each device shall have a unique ID, name, state, and authentication secret.</w:t>
+        <w:t xml:space="preserve">The IoT subsystem shall support at least 10 simulated smart-home devices. The devices may use the supported backend types: light, door, fan, </w:t>
+      </w:r>
+      <w:proofErr w:type="spellStart"/>
+      <w:r>
+        <w:t>coffee_machine</w:t>
+      </w:r>
+      <w:proofErr w:type="spellEnd"/>
+      <w:r>
+        <w:t xml:space="preserve">, </w:t>
+      </w:r>
+      <w:proofErr w:type="spellStart"/>
+      <w:r>
+        <w:t>temperature_sensor</w:t>
+      </w:r>
+      <w:proofErr w:type="spellEnd"/>
+      <w:r>
+        <w:t xml:space="preserve">, </w:t>
+      </w:r>
+      <w:proofErr w:type="spellStart"/>
+      <w:r>
+        <w:t>motion_sensor</w:t>
+      </w:r>
+      <w:proofErr w:type="spellEnd"/>
+      <w:r>
+        <w:t>, alarm, and window. Each device shall have a unique ID, name, state, and authentication secret.</w:t>
       </w:r>
     </w:p>
     <w:p/>
@@ -3593,28 +4365,28 @@
 </file>
 
 <file path=customXml/item1.xml><?xml version="1.0" encoding="utf-8"?>
+<b:Sources xmlns:b="http://schemas.openxmlformats.org/officeDocument/2006/bibliography" xmlns="http://schemas.openxmlformats.org/officeDocument/2006/bibliography" SelectedStyle="\APASixthEditionOfficeOnline.xsl" StyleName="APA" Version="6"/>
+</file>
+
+<file path=customXml/item2.xml><?xml version="1.0" encoding="utf-8"?>
 <go:gDocsCustomXmlDataStorage xmlns:go="http://customooxmlschemas.google.com/" xmlns:r="http://schemas.openxmlformats.org/officeDocument/2006/relationships" uri="GoogleDocsCustomDataVersion2">
   <go:docsCustomData xmlns:go="http://customooxmlschemas.google.com/" roundtripDataSignature="AMtx7miKRtfVLzTXqRrkG0x2WD1bh6MYDg==">CgMxLjAaEgoBMBINCgsIB0IHEgVDYXJkbxoSCgExEg0KCwgHQgcSBUNhcmRvMg5oLm53ZTFveDZieWxwNDIOaC5ia3RkajBtbGExMnIyDmguMnlwMmk1OGprcDE0Mg5oLml1YTc4c3NvNWVjcjIOaC4zMXMydnZwa2Q4MTcyDmgudjhzdmlkY293a25sMg5oLmt0OTRqMnl2NHo1eDIOaC52OXpiaHhpYWJ0ajMyDmguM3VteGttajc3cThkMg5oLmVldWc4endyYWNhdTIOaC41aTA1MHRpOXVjejcyDmgucDljbzd0Y3Q1NnJuMg5oLmFqMzVqNmZqaXJkMTgAciExU2hxbVc1VEM3Q0FxNWI5OS1TMVJxVlFwQ3JSQWNDXzM=</go:docsCustomData>
 </go:gDocsCustomXmlDataStorage>
 </file>
 
-<file path=customXml/item2.xml><?xml version="1.0" encoding="utf-8"?>
-<b:Sources xmlns:b="http://schemas.openxmlformats.org/officeDocument/2006/bibliography" xmlns="http://schemas.openxmlformats.org/officeDocument/2006/bibliography" SelectedStyle="\APASixthEditionOfficeOnline.xsl" StyleName="APA" Version="6"/>
+<file path=customXml/itemProps1.xml><?xml version="1.0" encoding="utf-8"?>
+<ds:datastoreItem xmlns:ds="http://schemas.openxmlformats.org/officeDocument/2006/customXml" ds:itemID="{3E42A137-3F8C-4DFF-9B7A-DB5915123F27}">
+  <ds:schemaRefs>
+    <ds:schemaRef ds:uri="http://schemas.openxmlformats.org/officeDocument/2006/bibliography"/>
+  </ds:schemaRefs>
+</ds:datastoreItem>
 </file>
 
-<file path=customXml/itemProps1.xml><?xml version="1.0" encoding="utf-8"?>
+<file path=customXml/itemProps2.xml><?xml version="1.0" encoding="utf-8"?>
 <ds:datastoreItem xmlns:ds="http://schemas.openxmlformats.org/officeDocument/2006/customXml" ds:itemID="{11111111-1234-1234-1234-123412341234}">
   <ds:schemaRefs>
     <ds:schemaRef ds:uri="http://customooxmlschemas.google.com/"/>
     <ds:schemaRef ds:uri="http://schemas.openxmlformats.org/officeDocument/2006/relationships"/>
   </ds:schemaRefs>
 </ds:datastoreItem>
-</file>
-
-<file path=customXml/itemProps2.xml><?xml version="1.0" encoding="utf-8"?>
-<ds:datastoreItem xmlns:ds="http://schemas.openxmlformats.org/officeDocument/2006/customXml" ds:itemID="{3E42A137-3F8C-4DFF-9B7A-DB5915123F27}">
-  <ds:schemaRefs>
-    <ds:schemaRef ds:uri="http://schemas.openxmlformats.org/officeDocument/2006/bibliography"/>
-  </ds:schemaRefs>
-</ds:datastoreItem>
 </file>
</xml_diff>

<commit_message>
Update artefact formatting and add SmartHouse logo
</commit_message>
<xml_diff>
--- a/iot/artifacts/meeting1/Requirements.docx
+++ b/iot/artifacts/meeting1/Requirements.docx
@@ -1,45 +1,135 @@
 
 <file path=word/document.xml><?xml version="1.0" encoding="utf-8"?>
-<w:document xmlns:wpc="http://schemas.microsoft.com/office/word/2010/wordprocessingCanvas" xmlns:cx="http://schemas.microsoft.com/office/drawing/2014/chartex" xmlns:cx1="http://schemas.microsoft.com/office/drawing/2015/9/8/chartex" xmlns:cx2="http://schemas.microsoft.com/office/drawing/2015/10/21/chartex" xmlns:cx3="http://schemas.microsoft.com/office/drawing/2016/5/9/chartex" xmlns:cx4="http://schemas.microsoft.com/office/drawing/2016/5/10/chartex" xmlns:cx5="http://schemas.microsoft.com/office/drawing/2016/5/11/chartex" xmlns:cx6="http://schemas.microsoft.com/office/drawing/2016/5/12/chartex" xmlns:cx7="http://schemas.microsoft.com/office/drawing/2016/5/13/chartex" xmlns:cx8="http://schemas.microsoft.com/office/drawing/2016/5/14/chartex" xmlns:mc="http://schemas.openxmlformats.org/markup-compatibility/2006" xmlns:aink="http://schemas.microsoft.com/office/drawing/2016/ink" xmlns:am3d="http://schemas.microsoft.com/office/drawing/2017/model3d" xmlns:o="urn:schemas-microsoft-com:office:office" xmlns:oel="http://schemas.microsoft.com/office/2019/extlst" xmlns:r="http://schemas.openxmlformats.org/officeDocument/2006/relationships" xmlns:m="http://schemas.openxmlformats.org/officeDocument/2006/math" xmlns:v="urn:schemas-microsoft-com:vml" xmlns:wp14="http://schemas.microsoft.com/office/word/2010/wordprocessingDrawing" xmlns:wp="http://schemas.openxmlformats.org/drawingml/2006/wordprocessingDrawing" xmlns:w10="urn:schemas-microsoft-com:office:word" xmlns:w="http://schemas.openxmlformats.org/wordprocessingml/2006/main" xmlns:w14="http://schemas.microsoft.com/office/word/2010/wordml" xmlns:w15="http://schemas.microsoft.com/office/word/2012/wordml" xmlns:w16cei="http://schemas.microsoft.com/office/word/2026/wordml/cei" xmlns:w16cex="http://schemas.microsoft.com/office/word/2018/wordml/cex" xmlns:w16cid="http://schemas.microsoft.com/office/word/2016/wordml/cid" xmlns:w16="http://schemas.microsoft.com/office/word/2018/wordml" xmlns:w16du="http://schemas.microsoft.com/office/word/2023/wordml/word16du" xmlns:w16sdtdh="http://schemas.microsoft.com/office/word/2020/wordml/sdtdatahash" xmlns:w16sdtfl="http://schemas.microsoft.com/office/word/2024/wordml/sdtformatlock" xmlns:w16se="http://schemas.microsoft.com/office/word/2015/wordml/symex" xmlns:wpg="http://schemas.microsoft.com/office/word/2010/wordprocessingGroup" xmlns:wpi="http://schemas.microsoft.com/office/word/2010/wordprocessingInk" xmlns:wne="http://schemas.microsoft.com/office/word/2006/wordml" xmlns:wps="http://schemas.microsoft.com/office/word/2010/wordprocessingShape" mc:Ignorable="w14 w15 w16se w16cid w16 w16cex w16sdtdh w16sdtfl w16du wp14">
+<w:document xmlns:wpc="http://schemas.microsoft.com/office/word/2010/wordprocessingCanvas" xmlns:cx="http://schemas.microsoft.com/office/drawing/2014/chartex" xmlns:cx1="http://schemas.microsoft.com/office/drawing/2015/9/8/chartex" xmlns:cx2="http://schemas.microsoft.com/office/drawing/2015/10/21/chartex" xmlns:cx3="http://schemas.microsoft.com/office/drawing/2016/5/9/chartex" xmlns:cx4="http://schemas.microsoft.com/office/drawing/2016/5/10/chartex" xmlns:cx5="http://schemas.microsoft.com/office/drawing/2016/5/11/chartex" xmlns:cx6="http://schemas.microsoft.com/office/drawing/2016/5/12/chartex" xmlns:cx7="http://schemas.microsoft.com/office/drawing/2016/5/13/chartex" xmlns:cx8="http://schemas.microsoft.com/office/drawing/2016/5/14/chartex" xmlns:mc="http://schemas.openxmlformats.org/markup-compatibility/2006" xmlns:aink="http://schemas.microsoft.com/office/drawing/2016/ink" xmlns:am3d="http://schemas.microsoft.com/office/drawing/2017/model3d" xmlns:o="urn:schemas-microsoft-com:office:office" xmlns:oel="http://schemas.microsoft.com/office/2019/extlst" xmlns:r="http://schemas.openxmlformats.org/officeDocument/2006/relationships" xmlns:m="http://schemas.openxmlformats.org/officeDocument/2006/math" xmlns:v="urn:schemas-microsoft-com:vml" xmlns:wp14="http://schemas.microsoft.com/office/word/2010/wordprocessingDrawing" xmlns:wp="http://schemas.openxmlformats.org/drawingml/2006/wordprocessingDrawing" xmlns:w10="urn:schemas-microsoft-com:office:word" xmlns:w="http://schemas.openxmlformats.org/wordprocessingml/2006/main" xmlns:w14="http://schemas.microsoft.com/office/word/2010/wordml" xmlns:w15="http://schemas.microsoft.com/office/word/2012/wordml" xmlns:w16cex="http://schemas.microsoft.com/office/word/2018/wordml/cex" xmlns:w16cid="http://schemas.microsoft.com/office/word/2016/wordml/cid" xmlns:w16="http://schemas.microsoft.com/office/word/2018/wordml" xmlns:w16du="http://schemas.microsoft.com/office/word/2023/wordml/word16du" xmlns:w16sdtdh="http://schemas.microsoft.com/office/word/2020/wordml/sdtdatahash" xmlns:w16sdtfl="http://schemas.microsoft.com/office/word/2024/wordml/sdtformatlock" xmlns:w16se="http://schemas.microsoft.com/office/word/2015/wordml/symex" xmlns:wpg="http://schemas.microsoft.com/office/word/2010/wordprocessingGroup" xmlns:wpi="http://schemas.microsoft.com/office/word/2010/wordprocessingInk" xmlns:wne="http://schemas.microsoft.com/office/word/2006/wordml" xmlns:wps="http://schemas.microsoft.com/office/word/2010/wordprocessingShape" mc:Ignorable="w14 w15 w16se w16cid w16 w16cex w16sdtdh w16sdtfl w16du wp14">
   <w:body>
     <w:p>
       <w:pPr>
         <w:pStyle w:val="Rubrik"/>
         <w:jc w:val="left"/>
         <w:rPr>
+          <w:rFonts w:asciiTheme="majorBidi" w:hAnsiTheme="majorBidi" w:cstheme="majorBidi"/>
           <w:sz w:val="60"/>
           <w:szCs w:val="60"/>
         </w:rPr>
       </w:pPr>
+      <w:r>
+        <w:rPr>
+          <w:noProof/>
+        </w:rPr>
+        <w:drawing>
+          <wp:anchor distT="0" distB="0" distL="114300" distR="114300" simplePos="0" relativeHeight="251658240" behindDoc="0" locked="0" layoutInCell="1" allowOverlap="1" wp14:anchorId="77B68F11" wp14:editId="7ECB1B67">
+            <wp:simplePos x="0" y="0"/>
+            <wp:positionH relativeFrom="column">
+              <wp:posOffset>5628005</wp:posOffset>
+            </wp:positionH>
+            <wp:positionV relativeFrom="paragraph">
+              <wp:posOffset>-893445</wp:posOffset>
+            </wp:positionV>
+            <wp:extent cx="1004400" cy="1004400"/>
+            <wp:effectExtent l="0" t="0" r="5715" b="5715"/>
+            <wp:wrapNone/>
+            <wp:docPr id="1364721233" name="Bildobjekt 1"/>
+            <wp:cNvGraphicFramePr>
+              <a:graphicFrameLocks xmlns:a="http://schemas.openxmlformats.org/drawingml/2006/main" noChangeAspect="1"/>
+            </wp:cNvGraphicFramePr>
+            <a:graphic xmlns:a="http://schemas.openxmlformats.org/drawingml/2006/main">
+              <a:graphicData uri="http://schemas.openxmlformats.org/drawingml/2006/picture">
+                <pic:pic xmlns:pic="http://schemas.openxmlformats.org/drawingml/2006/picture">
+                  <pic:nvPicPr>
+                    <pic:cNvPr id="1364721233" name="Bildobjekt 1"/>
+                    <pic:cNvPicPr>
+                      <a:picLocks noChangeAspect="1"/>
+                    </pic:cNvPicPr>
+                  </pic:nvPicPr>
+                  <pic:blipFill>
+                    <a:blip r:embed="rId6" cstate="print">
+                      <a:extLst>
+                        <a:ext uri="{28A0092B-C50C-407E-A947-70E740481C1C}">
+                          <a14:useLocalDpi xmlns:a14="http://schemas.microsoft.com/office/drawing/2010/main" val="0"/>
+                        </a:ext>
+                      </a:extLst>
+                    </a:blip>
+                    <a:srcRect/>
+                    <a:stretch>
+                      <a:fillRect/>
+                    </a:stretch>
+                  </pic:blipFill>
+                  <pic:spPr bwMode="auto">
+                    <a:xfrm>
+                      <a:off x="0" y="0"/>
+                      <a:ext cx="1004400" cy="1004400"/>
+                    </a:xfrm>
+                    <a:prstGeom prst="rect">
+                      <a:avLst/>
+                    </a:prstGeom>
+                    <a:noFill/>
+                    <a:ln>
+                      <a:noFill/>
+                    </a:ln>
+                  </pic:spPr>
+                </pic:pic>
+              </a:graphicData>
+            </a:graphic>
+            <wp14:sizeRelH relativeFrom="margin">
+              <wp14:pctWidth>0</wp14:pctWidth>
+            </wp14:sizeRelH>
+            <wp14:sizeRelV relativeFrom="margin">
+              <wp14:pctHeight>0</wp14:pctHeight>
+            </wp14:sizeRelV>
+          </wp:anchor>
+        </w:drawing>
+      </w:r>
+      <w:r>
+        <w:rPr>
+          <w:rFonts w:asciiTheme="majorBidi" w:hAnsiTheme="majorBidi" w:cstheme="majorBidi"/>
+          <w:sz w:val="60"/>
+          <w:szCs w:val="60"/>
+        </w:rPr>
+        <w:t xml:space="preserve">Requirements Documentation </w:t>
+      </w:r>
       <w:bookmarkStart w:id="0" w:name="_heading=h.nwe1ox6bylp4" w:colFirst="0" w:colLast="0"/>
       <w:bookmarkEnd w:id="0"/>
+    </w:p>
+    <w:p>
+      <w:pPr>
+        <w:rPr>
+          <w:rFonts w:asciiTheme="majorBidi" w:hAnsiTheme="majorBidi" w:cstheme="majorBidi"/>
+        </w:rPr>
+      </w:pPr>
+    </w:p>
+    <w:p>
+      <w:pPr>
+        <w:rPr>
+          <w:rFonts w:asciiTheme="majorBidi" w:hAnsiTheme="majorBidi" w:cstheme="majorBidi"/>
+        </w:rPr>
+      </w:pPr>
       <w:r>
         <w:rPr>
-          <w:sz w:val="60"/>
-          <w:szCs w:val="60"/>
-        </w:rPr>
-        <w:t xml:space="preserve">Requirements Documentation </w:t>
-      </w:r>
-    </w:p>
-    <w:p/>
-    <w:p>
-      <w:r>
+          <w:rFonts w:asciiTheme="majorBidi" w:hAnsiTheme="majorBidi" w:cstheme="majorBidi"/>
+        </w:rPr>
         <w:t xml:space="preserve">[GitHub]: </w:t>
       </w:r>
-      <w:hyperlink r:id="rId6" w:history="1">
+      <w:hyperlink r:id="rId7" w:history="1">
         <w:r>
           <w:rPr>
             <w:rStyle w:val="Hyperlnk"/>
+            <w:rFonts w:asciiTheme="majorBidi" w:hAnsiTheme="majorBidi" w:cstheme="majorBidi"/>
           </w:rPr>
           <w:t>https://github.com/tableba/SmartHouse/tree/ali-iot/iot</w:t>
         </w:r>
       </w:hyperlink>
     </w:p>
-    <w:p/>
+    <w:p>
+      <w:pPr>
+        <w:rPr>
+          <w:rFonts w:asciiTheme="majorBidi" w:hAnsiTheme="majorBidi" w:cstheme="majorBidi"/>
+        </w:rPr>
+      </w:pPr>
+    </w:p>
     <w:sdt>
       <w:sdtPr>
         <w:rPr>
-          <w:rFonts w:ascii="Times New Roman" w:eastAsia="Times New Roman" w:hAnsi="Times New Roman" w:cs="Times New Roman"/>
+          <w:rFonts w:asciiTheme="majorBidi" w:eastAsia="Times New Roman" w:hAnsiTheme="majorBidi" w:cs="Times New Roman"/>
           <w:color w:val="auto"/>
           <w:sz w:val="24"/>
           <w:szCs w:val="24"/>
@@ -61,6 +151,9 @@
         <w:p>
           <w:pPr>
             <w:pStyle w:val="Innehllsfrteckningsrubrik"/>
+            <w:rPr>
+              <w:rFonts w:asciiTheme="majorBidi" w:hAnsiTheme="majorBidi"/>
+            </w:rPr>
           </w:pPr>
         </w:p>
         <w:p>
@@ -70,7 +163,7 @@
               <w:tab w:val="right" w:leader="dot" w:pos="9062"/>
             </w:tabs>
             <w:rPr>
-              <w:rFonts w:asciiTheme="minorHAnsi" w:eastAsiaTheme="minorEastAsia" w:hAnsiTheme="minorHAnsi" w:cstheme="minorBidi"/>
+              <w:rFonts w:asciiTheme="majorBidi" w:eastAsiaTheme="minorEastAsia" w:hAnsiTheme="majorBidi" w:cstheme="majorBidi"/>
               <w:noProof/>
               <w:kern w:val="2"/>
               <w:lang w:val="sv-SE"/>
@@ -78,24 +171,35 @@
             </w:rPr>
           </w:pPr>
           <w:r>
+            <w:rPr>
+              <w:rFonts w:asciiTheme="majorBidi" w:hAnsiTheme="majorBidi" w:cstheme="majorBidi"/>
+            </w:rPr>
             <w:fldChar w:fldCharType="begin"/>
           </w:r>
           <w:r>
+            <w:rPr>
+              <w:rFonts w:asciiTheme="majorBidi" w:hAnsiTheme="majorBidi" w:cstheme="majorBidi"/>
+            </w:rPr>
             <w:instrText xml:space="preserve"> TOC \o "1-3" \h \z \u </w:instrText>
           </w:r>
           <w:r>
+            <w:rPr>
+              <w:rFonts w:asciiTheme="majorBidi" w:hAnsiTheme="majorBidi" w:cstheme="majorBidi"/>
+            </w:rPr>
             <w:fldChar w:fldCharType="separate"/>
           </w:r>
           <w:hyperlink w:anchor="_Toc236043812" w:history="1">
             <w:r>
               <w:rPr>
                 <w:rStyle w:val="Hyperlnk"/>
+                <w:rFonts w:asciiTheme="majorBidi" w:hAnsiTheme="majorBidi" w:cstheme="majorBidi"/>
                 <w:noProof/>
               </w:rPr>
               <w:t>Revision History</w:t>
             </w:r>
             <w:r>
               <w:rPr>
+                <w:rFonts w:asciiTheme="majorBidi" w:hAnsiTheme="majorBidi" w:cstheme="majorBidi"/>
                 <w:noProof/>
                 <w:webHidden/>
               </w:rPr>
@@ -103,6 +207,7 @@
             </w:r>
             <w:r>
               <w:rPr>
+                <w:rFonts w:asciiTheme="majorBidi" w:hAnsiTheme="majorBidi" w:cstheme="majorBidi"/>
                 <w:noProof/>
                 <w:webHidden/>
               </w:rPr>
@@ -110,6 +215,7 @@
             </w:r>
             <w:r>
               <w:rPr>
+                <w:rFonts w:asciiTheme="majorBidi" w:hAnsiTheme="majorBidi" w:cstheme="majorBidi"/>
                 <w:noProof/>
                 <w:webHidden/>
               </w:rPr>
@@ -117,12 +223,14 @@
             </w:r>
             <w:r>
               <w:rPr>
-                <w:noProof/>
-                <w:webHidden/>
-              </w:rPr>
-            </w:r>
-            <w:r>
-              <w:rPr>
+                <w:rFonts w:asciiTheme="majorBidi" w:hAnsiTheme="majorBidi" w:cstheme="majorBidi"/>
+                <w:noProof/>
+                <w:webHidden/>
+              </w:rPr>
+            </w:r>
+            <w:r>
+              <w:rPr>
+                <w:rFonts w:asciiTheme="majorBidi" w:hAnsiTheme="majorBidi" w:cstheme="majorBidi"/>
                 <w:noProof/>
                 <w:webHidden/>
               </w:rPr>
@@ -130,6 +238,7 @@
             </w:r>
             <w:r>
               <w:rPr>
+                <w:rFonts w:asciiTheme="majorBidi" w:hAnsiTheme="majorBidi" w:cstheme="majorBidi"/>
                 <w:noProof/>
                 <w:webHidden/>
               </w:rPr>
@@ -137,6 +246,7 @@
             </w:r>
             <w:r>
               <w:rPr>
+                <w:rFonts w:asciiTheme="majorBidi" w:hAnsiTheme="majorBidi" w:cstheme="majorBidi"/>
                 <w:noProof/>
                 <w:webHidden/>
               </w:rPr>
@@ -151,7 +261,7 @@
               <w:tab w:val="right" w:leader="dot" w:pos="9062"/>
             </w:tabs>
             <w:rPr>
-              <w:rFonts w:asciiTheme="minorHAnsi" w:eastAsiaTheme="minorEastAsia" w:hAnsiTheme="minorHAnsi" w:cstheme="minorBidi"/>
+              <w:rFonts w:asciiTheme="majorBidi" w:eastAsiaTheme="minorEastAsia" w:hAnsiTheme="majorBidi" w:cstheme="majorBidi"/>
               <w:noProof/>
               <w:kern w:val="2"/>
               <w:lang w:val="sv-SE"/>
@@ -162,12 +272,14 @@
             <w:r>
               <w:rPr>
                 <w:rStyle w:val="Hyperlnk"/>
+                <w:rFonts w:asciiTheme="majorBidi" w:hAnsiTheme="majorBidi" w:cstheme="majorBidi"/>
                 <w:noProof/>
               </w:rPr>
               <w:t>Requirements List</w:t>
             </w:r>
             <w:r>
               <w:rPr>
+                <w:rFonts w:asciiTheme="majorBidi" w:hAnsiTheme="majorBidi" w:cstheme="majorBidi"/>
                 <w:noProof/>
                 <w:webHidden/>
               </w:rPr>
@@ -175,6 +287,7 @@
             </w:r>
             <w:r>
               <w:rPr>
+                <w:rFonts w:asciiTheme="majorBidi" w:hAnsiTheme="majorBidi" w:cstheme="majorBidi"/>
                 <w:noProof/>
                 <w:webHidden/>
               </w:rPr>
@@ -182,6 +295,7 @@
             </w:r>
             <w:r>
               <w:rPr>
+                <w:rFonts w:asciiTheme="majorBidi" w:hAnsiTheme="majorBidi" w:cstheme="majorBidi"/>
                 <w:noProof/>
                 <w:webHidden/>
               </w:rPr>
@@ -189,12 +303,14 @@
             </w:r>
             <w:r>
               <w:rPr>
-                <w:noProof/>
-                <w:webHidden/>
-              </w:rPr>
-            </w:r>
-            <w:r>
-              <w:rPr>
+                <w:rFonts w:asciiTheme="majorBidi" w:hAnsiTheme="majorBidi" w:cstheme="majorBidi"/>
+                <w:noProof/>
+                <w:webHidden/>
+              </w:rPr>
+            </w:r>
+            <w:r>
+              <w:rPr>
+                <w:rFonts w:asciiTheme="majorBidi" w:hAnsiTheme="majorBidi" w:cstheme="majorBidi"/>
                 <w:noProof/>
                 <w:webHidden/>
               </w:rPr>
@@ -202,6 +318,7 @@
             </w:r>
             <w:r>
               <w:rPr>
+                <w:rFonts w:asciiTheme="majorBidi" w:hAnsiTheme="majorBidi" w:cstheme="majorBidi"/>
                 <w:noProof/>
                 <w:webHidden/>
               </w:rPr>
@@ -209,6 +326,7 @@
             </w:r>
             <w:r>
               <w:rPr>
+                <w:rFonts w:asciiTheme="majorBidi" w:hAnsiTheme="majorBidi" w:cstheme="majorBidi"/>
                 <w:noProof/>
                 <w:webHidden/>
               </w:rPr>
@@ -223,7 +341,7 @@
               <w:tab w:val="right" w:leader="dot" w:pos="9062"/>
             </w:tabs>
             <w:rPr>
-              <w:rFonts w:asciiTheme="minorHAnsi" w:eastAsiaTheme="minorEastAsia" w:hAnsiTheme="minorHAnsi" w:cstheme="minorBidi"/>
+              <w:rFonts w:asciiTheme="majorBidi" w:eastAsiaTheme="minorEastAsia" w:hAnsiTheme="majorBidi" w:cstheme="majorBidi"/>
               <w:noProof/>
               <w:kern w:val="2"/>
               <w:lang w:val="sv-SE"/>
@@ -234,12 +352,14 @@
             <w:r>
               <w:rPr>
                 <w:rStyle w:val="Hyperlnk"/>
+                <w:rFonts w:asciiTheme="majorBidi" w:hAnsiTheme="majorBidi" w:cstheme="majorBidi"/>
                 <w:noProof/>
               </w:rPr>
               <w:t>Requirements Descriptions</w:t>
             </w:r>
             <w:r>
               <w:rPr>
+                <w:rFonts w:asciiTheme="majorBidi" w:hAnsiTheme="majorBidi" w:cstheme="majorBidi"/>
                 <w:noProof/>
                 <w:webHidden/>
               </w:rPr>
@@ -247,6 +367,7 @@
             </w:r>
             <w:r>
               <w:rPr>
+                <w:rFonts w:asciiTheme="majorBidi" w:hAnsiTheme="majorBidi" w:cstheme="majorBidi"/>
                 <w:noProof/>
                 <w:webHidden/>
               </w:rPr>
@@ -254,6 +375,7 @@
             </w:r>
             <w:r>
               <w:rPr>
+                <w:rFonts w:asciiTheme="majorBidi" w:hAnsiTheme="majorBidi" w:cstheme="majorBidi"/>
                 <w:noProof/>
                 <w:webHidden/>
               </w:rPr>
@@ -261,12 +383,14 @@
             </w:r>
             <w:r>
               <w:rPr>
-                <w:noProof/>
-                <w:webHidden/>
-              </w:rPr>
-            </w:r>
-            <w:r>
-              <w:rPr>
+                <w:rFonts w:asciiTheme="majorBidi" w:hAnsiTheme="majorBidi" w:cstheme="majorBidi"/>
+                <w:noProof/>
+                <w:webHidden/>
+              </w:rPr>
+            </w:r>
+            <w:r>
+              <w:rPr>
+                <w:rFonts w:asciiTheme="majorBidi" w:hAnsiTheme="majorBidi" w:cstheme="majorBidi"/>
                 <w:noProof/>
                 <w:webHidden/>
               </w:rPr>
@@ -274,6 +398,7 @@
             </w:r>
             <w:r>
               <w:rPr>
+                <w:rFonts w:asciiTheme="majorBidi" w:hAnsiTheme="majorBidi" w:cstheme="majorBidi"/>
                 <w:noProof/>
                 <w:webHidden/>
               </w:rPr>
@@ -281,6 +406,7 @@
             </w:r>
             <w:r>
               <w:rPr>
+                <w:rFonts w:asciiTheme="majorBidi" w:hAnsiTheme="majorBidi" w:cstheme="majorBidi"/>
                 <w:noProof/>
                 <w:webHidden/>
               </w:rPr>
@@ -295,6 +421,7 @@
               <w:tab w:val="right" w:leader="dot" w:pos="9062"/>
             </w:tabs>
             <w:rPr>
+              <w:rFonts w:asciiTheme="majorBidi" w:hAnsiTheme="majorBidi" w:cstheme="majorBidi"/>
               <w:noProof/>
             </w:rPr>
           </w:pPr>
@@ -302,12 +429,14 @@
             <w:r>
               <w:rPr>
                 <w:rStyle w:val="Hyperlnk"/>
+                <w:rFonts w:asciiTheme="majorBidi" w:hAnsiTheme="majorBidi" w:cstheme="majorBidi"/>
                 <w:noProof/>
               </w:rPr>
               <w:t>R1: Wokwi Device Simulation</w:t>
             </w:r>
             <w:r>
               <w:rPr>
+                <w:rFonts w:asciiTheme="majorBidi" w:hAnsiTheme="majorBidi" w:cstheme="majorBidi"/>
                 <w:noProof/>
                 <w:webHidden/>
               </w:rPr>
@@ -315,6 +444,7 @@
             </w:r>
             <w:r>
               <w:rPr>
+                <w:rFonts w:asciiTheme="majorBidi" w:hAnsiTheme="majorBidi" w:cstheme="majorBidi"/>
                 <w:noProof/>
                 <w:webHidden/>
               </w:rPr>
@@ -322,6 +452,7 @@
             </w:r>
             <w:r>
               <w:rPr>
+                <w:rFonts w:asciiTheme="majorBidi" w:hAnsiTheme="majorBidi" w:cstheme="majorBidi"/>
                 <w:noProof/>
                 <w:webHidden/>
               </w:rPr>
@@ -329,12 +460,14 @@
             </w:r>
             <w:r>
               <w:rPr>
-                <w:noProof/>
-                <w:webHidden/>
-              </w:rPr>
-            </w:r>
-            <w:r>
-              <w:rPr>
+                <w:rFonts w:asciiTheme="majorBidi" w:hAnsiTheme="majorBidi" w:cstheme="majorBidi"/>
+                <w:noProof/>
+                <w:webHidden/>
+              </w:rPr>
+            </w:r>
+            <w:r>
+              <w:rPr>
+                <w:rFonts w:asciiTheme="majorBidi" w:hAnsiTheme="majorBidi" w:cstheme="majorBidi"/>
                 <w:noProof/>
                 <w:webHidden/>
               </w:rPr>
@@ -342,6 +475,7 @@
             </w:r>
             <w:r>
               <w:rPr>
+                <w:rFonts w:asciiTheme="majorBidi" w:hAnsiTheme="majorBidi" w:cstheme="majorBidi"/>
                 <w:noProof/>
                 <w:webHidden/>
               </w:rPr>
@@ -349,6 +483,7 @@
             </w:r>
             <w:r>
               <w:rPr>
+                <w:rFonts w:asciiTheme="majorBidi" w:hAnsiTheme="majorBidi" w:cstheme="majorBidi"/>
                 <w:noProof/>
                 <w:webHidden/>
               </w:rPr>
@@ -363,6 +498,7 @@
               <w:tab w:val="right" w:leader="dot" w:pos="9062"/>
             </w:tabs>
             <w:rPr>
+              <w:rFonts w:asciiTheme="majorBidi" w:hAnsiTheme="majorBidi" w:cstheme="majorBidi"/>
               <w:noProof/>
             </w:rPr>
           </w:pPr>
@@ -370,12 +506,14 @@
             <w:r>
               <w:rPr>
                 <w:rStyle w:val="Hyperlnk"/>
+                <w:rFonts w:asciiTheme="majorBidi" w:hAnsiTheme="majorBidi" w:cstheme="majorBidi"/>
                 <w:noProof/>
               </w:rPr>
               <w:t>R2: Wi-Fi and Backend Connection</w:t>
             </w:r>
             <w:r>
               <w:rPr>
+                <w:rFonts w:asciiTheme="majorBidi" w:hAnsiTheme="majorBidi" w:cstheme="majorBidi"/>
                 <w:noProof/>
                 <w:webHidden/>
               </w:rPr>
@@ -383,6 +521,7 @@
             </w:r>
             <w:r>
               <w:rPr>
+                <w:rFonts w:asciiTheme="majorBidi" w:hAnsiTheme="majorBidi" w:cstheme="majorBidi"/>
                 <w:noProof/>
                 <w:webHidden/>
               </w:rPr>
@@ -390,6 +529,7 @@
             </w:r>
             <w:r>
               <w:rPr>
+                <w:rFonts w:asciiTheme="majorBidi" w:hAnsiTheme="majorBidi" w:cstheme="majorBidi"/>
                 <w:noProof/>
                 <w:webHidden/>
               </w:rPr>
@@ -397,12 +537,14 @@
             </w:r>
             <w:r>
               <w:rPr>
-                <w:noProof/>
-                <w:webHidden/>
-              </w:rPr>
-            </w:r>
-            <w:r>
-              <w:rPr>
+                <w:rFonts w:asciiTheme="majorBidi" w:hAnsiTheme="majorBidi" w:cstheme="majorBidi"/>
+                <w:noProof/>
+                <w:webHidden/>
+              </w:rPr>
+            </w:r>
+            <w:r>
+              <w:rPr>
+                <w:rFonts w:asciiTheme="majorBidi" w:hAnsiTheme="majorBidi" w:cstheme="majorBidi"/>
                 <w:noProof/>
                 <w:webHidden/>
               </w:rPr>
@@ -410,6 +552,7 @@
             </w:r>
             <w:r>
               <w:rPr>
+                <w:rFonts w:asciiTheme="majorBidi" w:hAnsiTheme="majorBidi" w:cstheme="majorBidi"/>
                 <w:noProof/>
                 <w:webHidden/>
               </w:rPr>
@@ -417,6 +560,7 @@
             </w:r>
             <w:r>
               <w:rPr>
+                <w:rFonts w:asciiTheme="majorBidi" w:hAnsiTheme="majorBidi" w:cstheme="majorBidi"/>
                 <w:noProof/>
                 <w:webHidden/>
               </w:rPr>
@@ -431,6 +575,7 @@
               <w:tab w:val="right" w:leader="dot" w:pos="9062"/>
             </w:tabs>
             <w:rPr>
+              <w:rFonts w:asciiTheme="majorBidi" w:hAnsiTheme="majorBidi" w:cstheme="majorBidi"/>
               <w:noProof/>
             </w:rPr>
           </w:pPr>
@@ -438,12 +583,14 @@
             <w:r>
               <w:rPr>
                 <w:rStyle w:val="Hyperlnk"/>
+                <w:rFonts w:asciiTheme="majorBidi" w:hAnsiTheme="majorBidi" w:cstheme="majorBidi"/>
                 <w:noProof/>
               </w:rPr>
               <w:t>R3: Device Registration</w:t>
             </w:r>
             <w:r>
               <w:rPr>
+                <w:rFonts w:asciiTheme="majorBidi" w:hAnsiTheme="majorBidi" w:cstheme="majorBidi"/>
                 <w:noProof/>
                 <w:webHidden/>
               </w:rPr>
@@ -451,6 +598,7 @@
             </w:r>
             <w:r>
               <w:rPr>
+                <w:rFonts w:asciiTheme="majorBidi" w:hAnsiTheme="majorBidi" w:cstheme="majorBidi"/>
                 <w:noProof/>
                 <w:webHidden/>
               </w:rPr>
@@ -458,6 +606,7 @@
             </w:r>
             <w:r>
               <w:rPr>
+                <w:rFonts w:asciiTheme="majorBidi" w:hAnsiTheme="majorBidi" w:cstheme="majorBidi"/>
                 <w:noProof/>
                 <w:webHidden/>
               </w:rPr>
@@ -465,12 +614,14 @@
             </w:r>
             <w:r>
               <w:rPr>
-                <w:noProof/>
-                <w:webHidden/>
-              </w:rPr>
-            </w:r>
-            <w:r>
-              <w:rPr>
+                <w:rFonts w:asciiTheme="majorBidi" w:hAnsiTheme="majorBidi" w:cstheme="majorBidi"/>
+                <w:noProof/>
+                <w:webHidden/>
+              </w:rPr>
+            </w:r>
+            <w:r>
+              <w:rPr>
+                <w:rFonts w:asciiTheme="majorBidi" w:hAnsiTheme="majorBidi" w:cstheme="majorBidi"/>
                 <w:noProof/>
                 <w:webHidden/>
               </w:rPr>
@@ -478,6 +629,7 @@
             </w:r>
             <w:r>
               <w:rPr>
+                <w:rFonts w:asciiTheme="majorBidi" w:hAnsiTheme="majorBidi" w:cstheme="majorBidi"/>
                 <w:noProof/>
                 <w:webHidden/>
               </w:rPr>
@@ -485,6 +637,7 @@
             </w:r>
             <w:r>
               <w:rPr>
+                <w:rFonts w:asciiTheme="majorBidi" w:hAnsiTheme="majorBidi" w:cstheme="majorBidi"/>
                 <w:noProof/>
                 <w:webHidden/>
               </w:rPr>
@@ -499,6 +652,7 @@
               <w:tab w:val="right" w:leader="dot" w:pos="9062"/>
             </w:tabs>
             <w:rPr>
+              <w:rFonts w:asciiTheme="majorBidi" w:hAnsiTheme="majorBidi" w:cstheme="majorBidi"/>
               <w:noProof/>
             </w:rPr>
           </w:pPr>
@@ -506,12 +660,14 @@
             <w:r>
               <w:rPr>
                 <w:rStyle w:val="Hyperlnk"/>
+                <w:rFonts w:asciiTheme="majorBidi" w:hAnsiTheme="majorBidi" w:cstheme="majorBidi"/>
                 <w:noProof/>
               </w:rPr>
               <w:t>R4: Device Secret Authentication</w:t>
             </w:r>
             <w:r>
               <w:rPr>
+                <w:rFonts w:asciiTheme="majorBidi" w:hAnsiTheme="majorBidi" w:cstheme="majorBidi"/>
                 <w:noProof/>
                 <w:webHidden/>
               </w:rPr>
@@ -519,6 +675,7 @@
             </w:r>
             <w:r>
               <w:rPr>
+                <w:rFonts w:asciiTheme="majorBidi" w:hAnsiTheme="majorBidi" w:cstheme="majorBidi"/>
                 <w:noProof/>
                 <w:webHidden/>
               </w:rPr>
@@ -526,6 +683,7 @@
             </w:r>
             <w:r>
               <w:rPr>
+                <w:rFonts w:asciiTheme="majorBidi" w:hAnsiTheme="majorBidi" w:cstheme="majorBidi"/>
                 <w:noProof/>
                 <w:webHidden/>
               </w:rPr>
@@ -533,12 +691,14 @@
             </w:r>
             <w:r>
               <w:rPr>
-                <w:noProof/>
-                <w:webHidden/>
-              </w:rPr>
-            </w:r>
-            <w:r>
-              <w:rPr>
+                <w:rFonts w:asciiTheme="majorBidi" w:hAnsiTheme="majorBidi" w:cstheme="majorBidi"/>
+                <w:noProof/>
+                <w:webHidden/>
+              </w:rPr>
+            </w:r>
+            <w:r>
+              <w:rPr>
+                <w:rFonts w:asciiTheme="majorBidi" w:hAnsiTheme="majorBidi" w:cstheme="majorBidi"/>
                 <w:noProof/>
                 <w:webHidden/>
               </w:rPr>
@@ -546,6 +706,7 @@
             </w:r>
             <w:r>
               <w:rPr>
+                <w:rFonts w:asciiTheme="majorBidi" w:hAnsiTheme="majorBidi" w:cstheme="majorBidi"/>
                 <w:noProof/>
                 <w:webHidden/>
               </w:rPr>
@@ -553,6 +714,7 @@
             </w:r>
             <w:r>
               <w:rPr>
+                <w:rFonts w:asciiTheme="majorBidi" w:hAnsiTheme="majorBidi" w:cstheme="majorBidi"/>
                 <w:noProof/>
                 <w:webHidden/>
               </w:rPr>
@@ -567,6 +729,7 @@
               <w:tab w:val="right" w:leader="dot" w:pos="9062"/>
             </w:tabs>
             <w:rPr>
+              <w:rFonts w:asciiTheme="majorBidi" w:hAnsiTheme="majorBidi" w:cstheme="majorBidi"/>
               <w:noProof/>
             </w:rPr>
           </w:pPr>
@@ -574,12 +737,14 @@
             <w:r>
               <w:rPr>
                 <w:rStyle w:val="Hyperlnk"/>
+                <w:rFonts w:asciiTheme="majorBidi" w:hAnsiTheme="majorBidi" w:cstheme="majorBidi"/>
                 <w:noProof/>
               </w:rPr>
               <w:t>R5: Device Heartbeat</w:t>
             </w:r>
             <w:r>
               <w:rPr>
+                <w:rFonts w:asciiTheme="majorBidi" w:hAnsiTheme="majorBidi" w:cstheme="majorBidi"/>
                 <w:noProof/>
                 <w:webHidden/>
               </w:rPr>
@@ -587,6 +752,7 @@
             </w:r>
             <w:r>
               <w:rPr>
+                <w:rFonts w:asciiTheme="majorBidi" w:hAnsiTheme="majorBidi" w:cstheme="majorBidi"/>
                 <w:noProof/>
                 <w:webHidden/>
               </w:rPr>
@@ -594,6 +760,7 @@
             </w:r>
             <w:r>
               <w:rPr>
+                <w:rFonts w:asciiTheme="majorBidi" w:hAnsiTheme="majorBidi" w:cstheme="majorBidi"/>
                 <w:noProof/>
                 <w:webHidden/>
               </w:rPr>
@@ -601,12 +768,14 @@
             </w:r>
             <w:r>
               <w:rPr>
-                <w:noProof/>
-                <w:webHidden/>
-              </w:rPr>
-            </w:r>
-            <w:r>
-              <w:rPr>
+                <w:rFonts w:asciiTheme="majorBidi" w:hAnsiTheme="majorBidi" w:cstheme="majorBidi"/>
+                <w:noProof/>
+                <w:webHidden/>
+              </w:rPr>
+            </w:r>
+            <w:r>
+              <w:rPr>
+                <w:rFonts w:asciiTheme="majorBidi" w:hAnsiTheme="majorBidi" w:cstheme="majorBidi"/>
                 <w:noProof/>
                 <w:webHidden/>
               </w:rPr>
@@ -614,6 +783,7 @@
             </w:r>
             <w:r>
               <w:rPr>
+                <w:rFonts w:asciiTheme="majorBidi" w:hAnsiTheme="majorBidi" w:cstheme="majorBidi"/>
                 <w:noProof/>
                 <w:webHidden/>
               </w:rPr>
@@ -621,6 +791,7 @@
             </w:r>
             <w:r>
               <w:rPr>
+                <w:rFonts w:asciiTheme="majorBidi" w:hAnsiTheme="majorBidi" w:cstheme="majorBidi"/>
                 <w:noProof/>
                 <w:webHidden/>
               </w:rPr>
@@ -635,6 +806,7 @@
               <w:tab w:val="right" w:leader="dot" w:pos="9062"/>
             </w:tabs>
             <w:rPr>
+              <w:rFonts w:asciiTheme="majorBidi" w:hAnsiTheme="majorBidi" w:cstheme="majorBidi"/>
               <w:noProof/>
             </w:rPr>
           </w:pPr>
@@ -642,12 +814,14 @@
             <w:r>
               <w:rPr>
                 <w:rStyle w:val="Hyperlnk"/>
+                <w:rFonts w:asciiTheme="majorBidi" w:hAnsiTheme="majorBidi" w:cstheme="majorBidi"/>
                 <w:noProof/>
               </w:rPr>
               <w:t>R6: Device State Management</w:t>
             </w:r>
             <w:r>
               <w:rPr>
+                <w:rFonts w:asciiTheme="majorBidi" w:hAnsiTheme="majorBidi" w:cstheme="majorBidi"/>
                 <w:noProof/>
                 <w:webHidden/>
               </w:rPr>
@@ -655,6 +829,7 @@
             </w:r>
             <w:r>
               <w:rPr>
+                <w:rFonts w:asciiTheme="majorBidi" w:hAnsiTheme="majorBidi" w:cstheme="majorBidi"/>
                 <w:noProof/>
                 <w:webHidden/>
               </w:rPr>
@@ -662,6 +837,7 @@
             </w:r>
             <w:r>
               <w:rPr>
+                <w:rFonts w:asciiTheme="majorBidi" w:hAnsiTheme="majorBidi" w:cstheme="majorBidi"/>
                 <w:noProof/>
                 <w:webHidden/>
               </w:rPr>
@@ -669,12 +845,14 @@
             </w:r>
             <w:r>
               <w:rPr>
-                <w:noProof/>
-                <w:webHidden/>
-              </w:rPr>
-            </w:r>
-            <w:r>
-              <w:rPr>
+                <w:rFonts w:asciiTheme="majorBidi" w:hAnsiTheme="majorBidi" w:cstheme="majorBidi"/>
+                <w:noProof/>
+                <w:webHidden/>
+              </w:rPr>
+            </w:r>
+            <w:r>
+              <w:rPr>
+                <w:rFonts w:asciiTheme="majorBidi" w:hAnsiTheme="majorBidi" w:cstheme="majorBidi"/>
                 <w:noProof/>
                 <w:webHidden/>
               </w:rPr>
@@ -682,6 +860,7 @@
             </w:r>
             <w:r>
               <w:rPr>
+                <w:rFonts w:asciiTheme="majorBidi" w:hAnsiTheme="majorBidi" w:cstheme="majorBidi"/>
                 <w:noProof/>
                 <w:webHidden/>
               </w:rPr>
@@ -689,6 +868,7 @@
             </w:r>
             <w:r>
               <w:rPr>
+                <w:rFonts w:asciiTheme="majorBidi" w:hAnsiTheme="majorBidi" w:cstheme="majorBidi"/>
                 <w:noProof/>
                 <w:webHidden/>
               </w:rPr>
@@ -703,6 +883,7 @@
               <w:tab w:val="right" w:leader="dot" w:pos="9062"/>
             </w:tabs>
             <w:rPr>
+              <w:rFonts w:asciiTheme="majorBidi" w:hAnsiTheme="majorBidi" w:cstheme="majorBidi"/>
               <w:noProof/>
             </w:rPr>
           </w:pPr>
@@ -710,12 +891,14 @@
             <w:r>
               <w:rPr>
                 <w:rStyle w:val="Hyperlnk"/>
+                <w:rFonts w:asciiTheme="majorBidi" w:hAnsiTheme="majorBidi" w:cstheme="majorBidi"/>
                 <w:noProof/>
               </w:rPr>
               <w:t>R7: Backend Command Handling</w:t>
             </w:r>
             <w:r>
               <w:rPr>
+                <w:rFonts w:asciiTheme="majorBidi" w:hAnsiTheme="majorBidi" w:cstheme="majorBidi"/>
                 <w:noProof/>
                 <w:webHidden/>
               </w:rPr>
@@ -723,6 +906,7 @@
             </w:r>
             <w:r>
               <w:rPr>
+                <w:rFonts w:asciiTheme="majorBidi" w:hAnsiTheme="majorBidi" w:cstheme="majorBidi"/>
                 <w:noProof/>
                 <w:webHidden/>
               </w:rPr>
@@ -730,6 +914,7 @@
             </w:r>
             <w:r>
               <w:rPr>
+                <w:rFonts w:asciiTheme="majorBidi" w:hAnsiTheme="majorBidi" w:cstheme="majorBidi"/>
                 <w:noProof/>
                 <w:webHidden/>
               </w:rPr>
@@ -737,12 +922,14 @@
             </w:r>
             <w:r>
               <w:rPr>
-                <w:noProof/>
-                <w:webHidden/>
-              </w:rPr>
-            </w:r>
-            <w:r>
-              <w:rPr>
+                <w:rFonts w:asciiTheme="majorBidi" w:hAnsiTheme="majorBidi" w:cstheme="majorBidi"/>
+                <w:noProof/>
+                <w:webHidden/>
+              </w:rPr>
+            </w:r>
+            <w:r>
+              <w:rPr>
+                <w:rFonts w:asciiTheme="majorBidi" w:hAnsiTheme="majorBidi" w:cstheme="majorBidi"/>
                 <w:noProof/>
                 <w:webHidden/>
               </w:rPr>
@@ -750,6 +937,7 @@
             </w:r>
             <w:r>
               <w:rPr>
+                <w:rFonts w:asciiTheme="majorBidi" w:hAnsiTheme="majorBidi" w:cstheme="majorBidi"/>
                 <w:noProof/>
                 <w:webHidden/>
               </w:rPr>
@@ -757,6 +945,7 @@
             </w:r>
             <w:r>
               <w:rPr>
+                <w:rFonts w:asciiTheme="majorBidi" w:hAnsiTheme="majorBidi" w:cstheme="majorBidi"/>
                 <w:noProof/>
                 <w:webHidden/>
               </w:rPr>
@@ -771,6 +960,7 @@
               <w:tab w:val="right" w:leader="dot" w:pos="9062"/>
             </w:tabs>
             <w:rPr>
+              <w:rFonts w:asciiTheme="majorBidi" w:hAnsiTheme="majorBidi" w:cstheme="majorBidi"/>
               <w:noProof/>
             </w:rPr>
           </w:pPr>
@@ -778,12 +968,14 @@
             <w:r>
               <w:rPr>
                 <w:rStyle w:val="Hyperlnk"/>
+                <w:rFonts w:asciiTheme="majorBidi" w:hAnsiTheme="majorBidi" w:cstheme="majorBidi"/>
                 <w:noProof/>
               </w:rPr>
               <w:t>R8: Device State Reporting</w:t>
             </w:r>
             <w:r>
               <w:rPr>
+                <w:rFonts w:asciiTheme="majorBidi" w:hAnsiTheme="majorBidi" w:cstheme="majorBidi"/>
                 <w:noProof/>
                 <w:webHidden/>
               </w:rPr>
@@ -791,6 +983,7 @@
             </w:r>
             <w:r>
               <w:rPr>
+                <w:rFonts w:asciiTheme="majorBidi" w:hAnsiTheme="majorBidi" w:cstheme="majorBidi"/>
                 <w:noProof/>
                 <w:webHidden/>
               </w:rPr>
@@ -798,6 +991,7 @@
             </w:r>
             <w:r>
               <w:rPr>
+                <w:rFonts w:asciiTheme="majorBidi" w:hAnsiTheme="majorBidi" w:cstheme="majorBidi"/>
                 <w:noProof/>
                 <w:webHidden/>
               </w:rPr>
@@ -805,12 +999,14 @@
             </w:r>
             <w:r>
               <w:rPr>
-                <w:noProof/>
-                <w:webHidden/>
-              </w:rPr>
-            </w:r>
-            <w:r>
-              <w:rPr>
+                <w:rFonts w:asciiTheme="majorBidi" w:hAnsiTheme="majorBidi" w:cstheme="majorBidi"/>
+                <w:noProof/>
+                <w:webHidden/>
+              </w:rPr>
+            </w:r>
+            <w:r>
+              <w:rPr>
+                <w:rFonts w:asciiTheme="majorBidi" w:hAnsiTheme="majorBidi" w:cstheme="majorBidi"/>
                 <w:noProof/>
                 <w:webHidden/>
               </w:rPr>
@@ -818,6 +1014,7 @@
             </w:r>
             <w:r>
               <w:rPr>
+                <w:rFonts w:asciiTheme="majorBidi" w:hAnsiTheme="majorBidi" w:cstheme="majorBidi"/>
                 <w:noProof/>
                 <w:webHidden/>
               </w:rPr>
@@ -825,6 +1022,7 @@
             </w:r>
             <w:r>
               <w:rPr>
+                <w:rFonts w:asciiTheme="majorBidi" w:hAnsiTheme="majorBidi" w:cstheme="majorBidi"/>
                 <w:noProof/>
                 <w:webHidden/>
               </w:rPr>
@@ -839,6 +1037,7 @@
               <w:tab w:val="right" w:leader="dot" w:pos="9062"/>
             </w:tabs>
             <w:rPr>
+              <w:rFonts w:asciiTheme="majorBidi" w:hAnsiTheme="majorBidi" w:cstheme="majorBidi"/>
               <w:noProof/>
             </w:rPr>
           </w:pPr>
@@ -846,12 +1045,14 @@
             <w:r>
               <w:rPr>
                 <w:rStyle w:val="Hyperlnk"/>
+                <w:rFonts w:asciiTheme="majorBidi" w:hAnsiTheme="majorBidi" w:cstheme="majorBidi"/>
                 <w:noProof/>
               </w:rPr>
               <w:t>R9: Multiple Device Support</w:t>
             </w:r>
             <w:r>
               <w:rPr>
+                <w:rFonts w:asciiTheme="majorBidi" w:hAnsiTheme="majorBidi" w:cstheme="majorBidi"/>
                 <w:noProof/>
                 <w:webHidden/>
               </w:rPr>
@@ -859,6 +1060,7 @@
             </w:r>
             <w:r>
               <w:rPr>
+                <w:rFonts w:asciiTheme="majorBidi" w:hAnsiTheme="majorBidi" w:cstheme="majorBidi"/>
                 <w:noProof/>
                 <w:webHidden/>
               </w:rPr>
@@ -866,6 +1068,7 @@
             </w:r>
             <w:r>
               <w:rPr>
+                <w:rFonts w:asciiTheme="majorBidi" w:hAnsiTheme="majorBidi" w:cstheme="majorBidi"/>
                 <w:noProof/>
                 <w:webHidden/>
               </w:rPr>
@@ -873,12 +1076,14 @@
             </w:r>
             <w:r>
               <w:rPr>
-                <w:noProof/>
-                <w:webHidden/>
-              </w:rPr>
-            </w:r>
-            <w:r>
-              <w:rPr>
+                <w:rFonts w:asciiTheme="majorBidi" w:hAnsiTheme="majorBidi" w:cstheme="majorBidi"/>
+                <w:noProof/>
+                <w:webHidden/>
+              </w:rPr>
+            </w:r>
+            <w:r>
+              <w:rPr>
+                <w:rFonts w:asciiTheme="majorBidi" w:hAnsiTheme="majorBidi" w:cstheme="majorBidi"/>
                 <w:noProof/>
                 <w:webHidden/>
               </w:rPr>
@@ -886,6 +1091,7 @@
             </w:r>
             <w:r>
               <w:rPr>
+                <w:rFonts w:asciiTheme="majorBidi" w:hAnsiTheme="majorBidi" w:cstheme="majorBidi"/>
                 <w:noProof/>
                 <w:webHidden/>
               </w:rPr>
@@ -893,6 +1099,7 @@
             </w:r>
             <w:r>
               <w:rPr>
+                <w:rFonts w:asciiTheme="majorBidi" w:hAnsiTheme="majorBidi" w:cstheme="majorBidi"/>
                 <w:noProof/>
                 <w:webHidden/>
               </w:rPr>
@@ -901,8 +1108,14 @@
           </w:hyperlink>
         </w:p>
         <w:p>
+          <w:pPr>
+            <w:rPr>
+              <w:rFonts w:asciiTheme="majorBidi" w:hAnsiTheme="majorBidi" w:cstheme="majorBidi"/>
+            </w:rPr>
+          </w:pPr>
           <w:r>
             <w:rPr>
+              <w:rFonts w:asciiTheme="majorBidi" w:hAnsiTheme="majorBidi" w:cstheme="majorBidi"/>
               <w:b/>
               <w:bCs/>
             </w:rPr>
@@ -916,7 +1129,7 @@
         <w:widowControl w:val="0"/>
         <w:spacing w:before="480" w:after="60"/>
         <w:rPr>
-          <w:rFonts w:ascii="Arial" w:eastAsia="Arial" w:hAnsi="Arial" w:cs="Arial"/>
+          <w:rFonts w:asciiTheme="majorBidi" w:eastAsia="Arial" w:hAnsiTheme="majorBidi" w:cstheme="majorBidi"/>
           <w:b/>
           <w:bCs/>
           <w:sz w:val="32"/>
@@ -927,7 +1140,7 @@
       <w:proofErr w:type="spellStart"/>
       <w:r>
         <w:rPr>
-          <w:rFonts w:ascii="Arial" w:eastAsia="Arial" w:hAnsi="Arial" w:cs="Arial"/>
+          <w:rFonts w:asciiTheme="majorBidi" w:eastAsia="Arial" w:hAnsiTheme="majorBidi" w:cstheme="majorBidi"/>
           <w:b/>
           <w:bCs/>
           <w:sz w:val="32"/>
@@ -939,7 +1152,7 @@
       <w:proofErr w:type="spellEnd"/>
       <w:r>
         <w:rPr>
-          <w:rFonts w:ascii="Arial" w:eastAsia="Arial" w:hAnsi="Arial" w:cs="Arial"/>
+          <w:rFonts w:asciiTheme="majorBidi" w:eastAsia="Arial" w:hAnsiTheme="majorBidi" w:cstheme="majorBidi"/>
           <w:b/>
           <w:bCs/>
           <w:sz w:val="32"/>
@@ -951,7 +1164,7 @@
       <w:proofErr w:type="spellStart"/>
       <w:r>
         <w:rPr>
-          <w:rFonts w:ascii="Arial" w:eastAsia="Arial" w:hAnsi="Arial" w:cs="Arial"/>
+          <w:rFonts w:asciiTheme="majorBidi" w:eastAsia="Arial" w:hAnsiTheme="majorBidi" w:cstheme="majorBidi"/>
           <w:b/>
           <w:bCs/>
           <w:sz w:val="32"/>
@@ -962,18 +1175,36 @@
       </w:r>
       <w:proofErr w:type="spellEnd"/>
     </w:p>
-    <w:p/>
+    <w:p>
+      <w:pPr>
+        <w:rPr>
+          <w:rFonts w:asciiTheme="majorBidi" w:hAnsiTheme="majorBidi" w:cstheme="majorBidi"/>
+        </w:rPr>
+      </w:pPr>
+    </w:p>
     <w:p>
       <w:pPr>
         <w:pStyle w:val="Rubrik1"/>
+        <w:rPr>
+          <w:rFonts w:asciiTheme="majorBidi" w:hAnsiTheme="majorBidi" w:cstheme="majorBidi"/>
+        </w:rPr>
       </w:pPr>
       <w:bookmarkStart w:id="1" w:name="_Toc236043812"/>
       <w:r>
+        <w:rPr>
+          <w:rFonts w:asciiTheme="majorBidi" w:hAnsiTheme="majorBidi" w:cstheme="majorBidi"/>
+        </w:rPr>
         <w:t>Revision History</w:t>
       </w:r>
       <w:bookmarkEnd w:id="1"/>
     </w:p>
-    <w:p/>
+    <w:p>
+      <w:pPr>
+        <w:rPr>
+          <w:rFonts w:asciiTheme="majorBidi" w:hAnsiTheme="majorBidi" w:cstheme="majorBidi"/>
+        </w:rPr>
+      </w:pPr>
+    </w:p>
     <w:tbl>
       <w:tblPr>
         <w:tblStyle w:val="a"/>
@@ -1015,6 +1246,7 @@
               <w:spacing w:after="120"/>
               <w:jc w:val="center"/>
               <w:rPr>
+                <w:rFonts w:asciiTheme="majorBidi" w:hAnsiTheme="majorBidi" w:cstheme="majorBidi"/>
                 <w:color w:val="000000"/>
                 <w:sz w:val="20"/>
                 <w:szCs w:val="20"/>
@@ -1022,6 +1254,7 @@
             </w:pPr>
             <w:r>
               <w:rPr>
+                <w:rFonts w:asciiTheme="majorBidi" w:hAnsiTheme="majorBidi" w:cstheme="majorBidi"/>
                 <w:b/>
                 <w:bCs/>
                 <w:color w:val="000000"/>
@@ -1050,6 +1283,7 @@
               <w:spacing w:after="120"/>
               <w:jc w:val="center"/>
               <w:rPr>
+                <w:rFonts w:asciiTheme="majorBidi" w:hAnsiTheme="majorBidi" w:cstheme="majorBidi"/>
                 <w:color w:val="000000"/>
                 <w:sz w:val="20"/>
                 <w:szCs w:val="20"/>
@@ -1057,6 +1291,7 @@
             </w:pPr>
             <w:r>
               <w:rPr>
+                <w:rFonts w:asciiTheme="majorBidi" w:hAnsiTheme="majorBidi" w:cstheme="majorBidi"/>
                 <w:b/>
                 <w:bCs/>
                 <w:color w:val="000000"/>
@@ -1085,6 +1320,7 @@
               <w:spacing w:after="120"/>
               <w:jc w:val="center"/>
               <w:rPr>
+                <w:rFonts w:asciiTheme="majorBidi" w:hAnsiTheme="majorBidi" w:cstheme="majorBidi"/>
                 <w:color w:val="000000"/>
                 <w:sz w:val="20"/>
                 <w:szCs w:val="20"/>
@@ -1092,6 +1328,7 @@
             </w:pPr>
             <w:r>
               <w:rPr>
+                <w:rFonts w:asciiTheme="majorBidi" w:hAnsiTheme="majorBidi" w:cstheme="majorBidi"/>
                 <w:b/>
                 <w:bCs/>
                 <w:color w:val="000000"/>
@@ -1120,6 +1357,7 @@
               <w:spacing w:after="120"/>
               <w:jc w:val="center"/>
               <w:rPr>
+                <w:rFonts w:asciiTheme="majorBidi" w:hAnsiTheme="majorBidi" w:cstheme="majorBidi"/>
                 <w:color w:val="000000"/>
                 <w:sz w:val="20"/>
                 <w:szCs w:val="20"/>
@@ -1127,6 +1365,7 @@
             </w:pPr>
             <w:r>
               <w:rPr>
+                <w:rFonts w:asciiTheme="majorBidi" w:hAnsiTheme="majorBidi" w:cstheme="majorBidi"/>
                 <w:b/>
                 <w:bCs/>
                 <w:color w:val="000000"/>
@@ -1156,6 +1395,7 @@
               </w:pBdr>
               <w:spacing w:after="120"/>
               <w:rPr>
+                <w:rFonts w:asciiTheme="majorBidi" w:hAnsiTheme="majorBidi" w:cstheme="majorBidi"/>
                 <w:color w:val="000000"/>
                 <w:sz w:val="20"/>
                 <w:szCs w:val="20"/>
@@ -1163,6 +1403,7 @@
             </w:pPr>
             <w:r>
               <w:rPr>
+                <w:rFonts w:asciiTheme="majorBidi" w:hAnsiTheme="majorBidi" w:cstheme="majorBidi"/>
                 <w:color w:val="000000"/>
                 <w:sz w:val="20"/>
                 <w:szCs w:val="20"/>
@@ -1188,6 +1429,7 @@
               </w:pBdr>
               <w:spacing w:after="120"/>
               <w:rPr>
+                <w:rFonts w:asciiTheme="majorBidi" w:hAnsiTheme="majorBidi" w:cstheme="majorBidi"/>
                 <w:color w:val="000000"/>
                 <w:sz w:val="20"/>
                 <w:szCs w:val="20"/>
@@ -1195,6 +1437,7 @@
             </w:pPr>
             <w:r>
               <w:rPr>
+                <w:rFonts w:asciiTheme="majorBidi" w:hAnsiTheme="majorBidi" w:cstheme="majorBidi"/>
                 <w:color w:val="000000"/>
                 <w:sz w:val="20"/>
                 <w:szCs w:val="20"/>
@@ -1220,6 +1463,7 @@
               </w:pBdr>
               <w:spacing w:after="120"/>
               <w:rPr>
+                <w:rFonts w:asciiTheme="majorBidi" w:hAnsiTheme="majorBidi" w:cstheme="majorBidi"/>
                 <w:color w:val="000000"/>
                 <w:sz w:val="20"/>
                 <w:szCs w:val="20"/>
@@ -1227,6 +1471,7 @@
             </w:pPr>
             <w:r>
               <w:rPr>
+                <w:rFonts w:asciiTheme="majorBidi" w:hAnsiTheme="majorBidi" w:cstheme="majorBidi"/>
                 <w:color w:val="000000"/>
                 <w:sz w:val="20"/>
                 <w:szCs w:val="20"/>
@@ -1236,6 +1481,7 @@
             <w:proofErr w:type="spellStart"/>
             <w:r>
               <w:rPr>
+                <w:rFonts w:asciiTheme="majorBidi" w:hAnsiTheme="majorBidi" w:cstheme="majorBidi"/>
                 <w:color w:val="000000"/>
                 <w:sz w:val="20"/>
                 <w:szCs w:val="20"/>
@@ -1245,6 +1491,7 @@
             <w:proofErr w:type="spellEnd"/>
             <w:r>
               <w:rPr>
+                <w:rFonts w:asciiTheme="majorBidi" w:hAnsiTheme="majorBidi" w:cstheme="majorBidi"/>
                 <w:color w:val="000000"/>
                 <w:sz w:val="20"/>
                 <w:szCs w:val="20"/>
@@ -1270,6 +1517,7 @@
               </w:pBdr>
               <w:spacing w:after="120"/>
               <w:rPr>
+                <w:rFonts w:asciiTheme="majorBidi" w:hAnsiTheme="majorBidi" w:cstheme="majorBidi"/>
                 <w:color w:val="000000"/>
                 <w:sz w:val="20"/>
                 <w:szCs w:val="20"/>
@@ -1277,6 +1525,7 @@
             </w:pPr>
             <w:r>
               <w:rPr>
+                <w:rFonts w:asciiTheme="majorBidi" w:hAnsiTheme="majorBidi" w:cstheme="majorBidi"/>
                 <w:color w:val="000000"/>
                 <w:sz w:val="20"/>
                 <w:szCs w:val="20"/>
@@ -1304,6 +1553,7 @@
               </w:pBdr>
               <w:spacing w:after="120"/>
               <w:rPr>
+                <w:rFonts w:asciiTheme="majorBidi" w:hAnsiTheme="majorBidi" w:cstheme="majorBidi"/>
                 <w:color w:val="000000"/>
                 <w:sz w:val="20"/>
                 <w:szCs w:val="20"/>
@@ -1311,6 +1561,7 @@
             </w:pPr>
             <w:r>
               <w:rPr>
+                <w:rFonts w:asciiTheme="majorBidi" w:hAnsiTheme="majorBidi" w:cstheme="majorBidi"/>
                 <w:color w:val="000000"/>
                 <w:sz w:val="20"/>
                 <w:szCs w:val="20"/>
@@ -1336,6 +1587,7 @@
               </w:pBdr>
               <w:spacing w:after="120"/>
               <w:rPr>
+                <w:rFonts w:asciiTheme="majorBidi" w:hAnsiTheme="majorBidi" w:cstheme="majorBidi"/>
                 <w:color w:val="000000"/>
                 <w:sz w:val="20"/>
                 <w:szCs w:val="20"/>
@@ -1343,6 +1595,7 @@
             </w:pPr>
             <w:r>
               <w:rPr>
+                <w:rFonts w:asciiTheme="majorBidi" w:hAnsiTheme="majorBidi" w:cstheme="majorBidi"/>
                 <w:color w:val="000000"/>
                 <w:sz w:val="20"/>
                 <w:szCs w:val="20"/>
@@ -1368,6 +1621,7 @@
               </w:pBdr>
               <w:spacing w:after="120"/>
               <w:rPr>
+                <w:rFonts w:asciiTheme="majorBidi" w:hAnsiTheme="majorBidi" w:cstheme="majorBidi"/>
                 <w:color w:val="000000"/>
                 <w:sz w:val="20"/>
                 <w:szCs w:val="20"/>
@@ -1376,6 +1630,7 @@
             <w:proofErr w:type="spellStart"/>
             <w:r>
               <w:rPr>
+                <w:rFonts w:asciiTheme="majorBidi" w:hAnsiTheme="majorBidi" w:cstheme="majorBidi"/>
                 <w:color w:val="000000"/>
                 <w:sz w:val="20"/>
                 <w:szCs w:val="20"/>
@@ -1385,6 +1640,7 @@
             <w:proofErr w:type="spellEnd"/>
             <w:r>
               <w:rPr>
+                <w:rFonts w:asciiTheme="majorBidi" w:hAnsiTheme="majorBidi" w:cstheme="majorBidi"/>
                 <w:color w:val="000000"/>
                 <w:sz w:val="20"/>
                 <w:szCs w:val="20"/>
@@ -1410,6 +1666,7 @@
               </w:pBdr>
               <w:spacing w:after="120"/>
               <w:rPr>
+                <w:rFonts w:asciiTheme="majorBidi" w:hAnsiTheme="majorBidi" w:cstheme="majorBidi"/>
                 <w:color w:val="000000"/>
                 <w:sz w:val="20"/>
                 <w:szCs w:val="20"/>
@@ -1417,6 +1674,7 @@
             </w:pPr>
             <w:r>
               <w:rPr>
+                <w:rFonts w:asciiTheme="majorBidi" w:hAnsiTheme="majorBidi" w:cstheme="majorBidi"/>
                 <w:color w:val="000000"/>
                 <w:sz w:val="20"/>
                 <w:szCs w:val="20"/>
@@ -1444,6 +1702,7 @@
               </w:pBdr>
               <w:spacing w:after="120"/>
               <w:rPr>
+                <w:rFonts w:asciiTheme="majorBidi" w:hAnsiTheme="majorBidi" w:cstheme="majorBidi"/>
                 <w:color w:val="000000"/>
                 <w:sz w:val="20"/>
                 <w:szCs w:val="20"/>
@@ -1451,6 +1710,7 @@
             </w:pPr>
             <w:r>
               <w:rPr>
+                <w:rFonts w:asciiTheme="majorBidi" w:hAnsiTheme="majorBidi" w:cstheme="majorBidi"/>
                 <w:color w:val="000000"/>
                 <w:sz w:val="20"/>
                 <w:szCs w:val="20"/>
@@ -1476,6 +1736,7 @@
               </w:pBdr>
               <w:spacing w:after="120"/>
               <w:rPr>
+                <w:rFonts w:asciiTheme="majorBidi" w:hAnsiTheme="majorBidi" w:cstheme="majorBidi"/>
                 <w:color w:val="000000"/>
                 <w:sz w:val="20"/>
                 <w:szCs w:val="20"/>
@@ -1483,6 +1744,7 @@
             </w:pPr>
             <w:r>
               <w:rPr>
+                <w:rFonts w:asciiTheme="majorBidi" w:hAnsiTheme="majorBidi" w:cstheme="majorBidi"/>
                 <w:color w:val="000000"/>
                 <w:sz w:val="20"/>
                 <w:szCs w:val="20"/>
@@ -1491,6 +1753,7 @@
             </w:r>
             <w:r>
               <w:rPr>
+                <w:rFonts w:asciiTheme="majorBidi" w:hAnsiTheme="majorBidi" w:cstheme="majorBidi"/>
                 <w:color w:val="000000"/>
                 <w:sz w:val="20"/>
                 <w:szCs w:val="20"/>
@@ -1516,6 +1779,7 @@
               </w:pBdr>
               <w:spacing w:after="120"/>
               <w:rPr>
+                <w:rFonts w:asciiTheme="majorBidi" w:hAnsiTheme="majorBidi" w:cstheme="majorBidi"/>
                 <w:color w:val="000000"/>
                 <w:sz w:val="20"/>
                 <w:szCs w:val="20"/>
@@ -1523,6 +1787,7 @@
             </w:pPr>
             <w:r>
               <w:rPr>
+                <w:rFonts w:asciiTheme="majorBidi" w:hAnsiTheme="majorBidi" w:cstheme="majorBidi"/>
                 <w:color w:val="000000"/>
                 <w:sz w:val="20"/>
                 <w:szCs w:val="20"/>
@@ -1548,6 +1813,7 @@
               </w:pBdr>
               <w:spacing w:after="120"/>
               <w:rPr>
+                <w:rFonts w:asciiTheme="majorBidi" w:hAnsiTheme="majorBidi" w:cstheme="majorBidi"/>
                 <w:color w:val="000000"/>
                 <w:sz w:val="20"/>
                 <w:szCs w:val="20"/>
@@ -1555,6 +1821,7 @@
             </w:pPr>
             <w:r>
               <w:rPr>
+                <w:rFonts w:asciiTheme="majorBidi" w:hAnsiTheme="majorBidi" w:cstheme="majorBidi"/>
                 <w:color w:val="000000"/>
                 <w:sz w:val="20"/>
                 <w:szCs w:val="20"/>
@@ -1568,15 +1835,30 @@
     <w:p>
       <w:pPr>
         <w:pStyle w:val="Rubrik3"/>
+        <w:rPr>
+          <w:rFonts w:asciiTheme="majorBidi" w:hAnsiTheme="majorBidi" w:cstheme="majorBidi"/>
+        </w:rPr>
       </w:pPr>
     </w:p>
-    <w:p/>
+    <w:p>
+      <w:pPr>
+        <w:rPr>
+          <w:rFonts w:asciiTheme="majorBidi" w:hAnsiTheme="majorBidi" w:cstheme="majorBidi"/>
+        </w:rPr>
+      </w:pPr>
+    </w:p>
     <w:p>
       <w:pPr>
         <w:pStyle w:val="Rubrik1"/>
+        <w:rPr>
+          <w:rFonts w:asciiTheme="majorBidi" w:hAnsiTheme="majorBidi" w:cstheme="majorBidi"/>
+        </w:rPr>
       </w:pPr>
       <w:bookmarkStart w:id="2" w:name="_Toc236043813"/>
       <w:r>
+        <w:rPr>
+          <w:rFonts w:asciiTheme="majorBidi" w:hAnsiTheme="majorBidi" w:cstheme="majorBidi"/>
+        </w:rPr>
         <w:t>Requirements List</w:t>
       </w:r>
       <w:bookmarkEnd w:id="2"/>
@@ -1614,6 +1896,7 @@
               <w:pStyle w:val="Rubrik"/>
               <w:jc w:val="left"/>
               <w:rPr>
+                <w:rFonts w:asciiTheme="majorBidi" w:hAnsiTheme="majorBidi" w:cstheme="majorBidi"/>
                 <w:b w:val="0"/>
                 <w:bCs w:val="0"/>
                 <w:sz w:val="22"/>
@@ -1624,6 +1907,7 @@
             <w:proofErr w:type="spellStart"/>
             <w:r>
               <w:rPr>
+                <w:rFonts w:asciiTheme="majorBidi" w:hAnsiTheme="majorBidi" w:cstheme="majorBidi"/>
                 <w:b w:val="0"/>
                 <w:bCs w:val="0"/>
                 <w:sz w:val="22"/>
@@ -1635,6 +1919,7 @@
             <w:proofErr w:type="spellEnd"/>
             <w:r>
               <w:rPr>
+                <w:rFonts w:asciiTheme="majorBidi" w:hAnsiTheme="majorBidi" w:cstheme="majorBidi"/>
                 <w:b w:val="0"/>
                 <w:bCs w:val="0"/>
                 <w:sz w:val="22"/>
@@ -1646,6 +1931,7 @@
             <w:proofErr w:type="spellStart"/>
             <w:r>
               <w:rPr>
+                <w:rFonts w:asciiTheme="majorBidi" w:hAnsiTheme="majorBidi" w:cstheme="majorBidi"/>
                 <w:b w:val="0"/>
                 <w:bCs w:val="0"/>
                 <w:sz w:val="22"/>
@@ -1668,6 +1954,7 @@
               <w:pStyle w:val="Rubrik"/>
               <w:jc w:val="left"/>
               <w:rPr>
+                <w:rFonts w:asciiTheme="majorBidi" w:hAnsiTheme="majorBidi" w:cstheme="majorBidi"/>
                 <w:b w:val="0"/>
                 <w:bCs w:val="0"/>
                 <w:sz w:val="22"/>
@@ -1678,6 +1965,7 @@
             <w:proofErr w:type="spellStart"/>
             <w:r>
               <w:rPr>
+                <w:rFonts w:asciiTheme="majorBidi" w:hAnsiTheme="majorBidi" w:cstheme="majorBidi"/>
                 <w:b w:val="0"/>
                 <w:bCs w:val="0"/>
                 <w:sz w:val="22"/>
@@ -1700,6 +1988,7 @@
               <w:pStyle w:val="Rubrik"/>
               <w:jc w:val="left"/>
               <w:rPr>
+                <w:rFonts w:asciiTheme="majorBidi" w:hAnsiTheme="majorBidi" w:cstheme="majorBidi"/>
                 <w:b w:val="0"/>
                 <w:bCs w:val="0"/>
                 <w:sz w:val="22"/>
@@ -1709,6 +1998,7 @@
             </w:pPr>
             <w:r>
               <w:rPr>
+                <w:rFonts w:asciiTheme="majorBidi" w:hAnsiTheme="majorBidi" w:cstheme="majorBidi"/>
                 <w:b w:val="0"/>
                 <w:bCs w:val="0"/>
                 <w:sz w:val="22"/>
@@ -1735,6 +2025,7 @@
               <w:pStyle w:val="Rubrik"/>
               <w:jc w:val="left"/>
               <w:rPr>
+                <w:rFonts w:asciiTheme="majorBidi" w:hAnsiTheme="majorBidi" w:cstheme="majorBidi"/>
                 <w:b w:val="0"/>
                 <w:bCs w:val="0"/>
                 <w:sz w:val="22"/>
@@ -1744,6 +2035,7 @@
             </w:pPr>
             <w:r>
               <w:rPr>
+                <w:rFonts w:asciiTheme="majorBidi" w:hAnsiTheme="majorBidi" w:cstheme="majorBidi"/>
                 <w:b w:val="0"/>
                 <w:bCs w:val="0"/>
                 <w:sz w:val="22"/>
@@ -1755,6 +2047,7 @@
             <w:proofErr w:type="spellStart"/>
             <w:r>
               <w:rPr>
+                <w:rFonts w:asciiTheme="majorBidi" w:hAnsiTheme="majorBidi" w:cstheme="majorBidi"/>
                 <w:b w:val="0"/>
                 <w:bCs w:val="0"/>
                 <w:sz w:val="22"/>
@@ -1766,6 +2059,7 @@
             <w:proofErr w:type="spellEnd"/>
             <w:r>
               <w:rPr>
+                <w:rFonts w:asciiTheme="majorBidi" w:hAnsiTheme="majorBidi" w:cstheme="majorBidi"/>
                 <w:b w:val="0"/>
                 <w:bCs w:val="0"/>
                 <w:sz w:val="22"/>
@@ -1777,6 +2071,7 @@
             <w:proofErr w:type="spellStart"/>
             <w:r>
               <w:rPr>
+                <w:rFonts w:asciiTheme="majorBidi" w:hAnsiTheme="majorBidi" w:cstheme="majorBidi"/>
                 <w:b w:val="0"/>
                 <w:bCs w:val="0"/>
                 <w:sz w:val="22"/>
@@ -1788,6 +2083,7 @@
             <w:proofErr w:type="spellEnd"/>
             <w:r>
               <w:rPr>
+                <w:rFonts w:asciiTheme="majorBidi" w:hAnsiTheme="majorBidi" w:cstheme="majorBidi"/>
                 <w:b w:val="0"/>
                 <w:bCs w:val="0"/>
                 <w:sz w:val="22"/>
@@ -1809,6 +2105,7 @@
               <w:pStyle w:val="Rubrik"/>
               <w:jc w:val="left"/>
               <w:rPr>
+                <w:rFonts w:asciiTheme="majorBidi" w:hAnsiTheme="majorBidi" w:cstheme="majorBidi"/>
                 <w:b w:val="0"/>
                 <w:bCs w:val="0"/>
                 <w:sz w:val="22"/>
@@ -1819,6 +2116,7 @@
             <w:proofErr w:type="spellStart"/>
             <w:r>
               <w:rPr>
+                <w:rFonts w:asciiTheme="majorBidi" w:hAnsiTheme="majorBidi" w:cstheme="majorBidi"/>
                 <w:b w:val="0"/>
                 <w:bCs w:val="0"/>
                 <w:sz w:val="22"/>
@@ -1841,6 +2139,7 @@
               <w:pStyle w:val="Rubrik"/>
               <w:jc w:val="left"/>
               <w:rPr>
+                <w:rFonts w:asciiTheme="majorBidi" w:hAnsiTheme="majorBidi" w:cstheme="majorBidi"/>
                 <w:b w:val="0"/>
                 <w:bCs w:val="0"/>
                 <w:sz w:val="22"/>
@@ -1850,6 +2149,7 @@
             </w:pPr>
             <w:r>
               <w:rPr>
+                <w:rFonts w:asciiTheme="majorBidi" w:hAnsiTheme="majorBidi" w:cstheme="majorBidi"/>
                 <w:b w:val="0"/>
                 <w:bCs w:val="0"/>
                 <w:sz w:val="22"/>
@@ -1860,6 +2160,7 @@
             </w:r>
             <w:r>
               <w:rPr>
+                <w:rFonts w:asciiTheme="majorBidi" w:hAnsiTheme="majorBidi" w:cstheme="majorBidi"/>
                 <w:b w:val="0"/>
                 <w:bCs w:val="0"/>
                 <w:sz w:val="22"/>
@@ -1886,6 +2187,7 @@
               <w:pStyle w:val="Rubrik"/>
               <w:jc w:val="left"/>
               <w:rPr>
+                <w:rFonts w:asciiTheme="majorBidi" w:hAnsiTheme="majorBidi" w:cstheme="majorBidi"/>
                 <w:b w:val="0"/>
                 <w:bCs w:val="0"/>
                 <w:sz w:val="22"/>
@@ -1895,6 +2197,7 @@
             </w:pPr>
             <w:r>
               <w:rPr>
+                <w:rFonts w:asciiTheme="majorBidi" w:hAnsiTheme="majorBidi" w:cstheme="majorBidi"/>
                 <w:b w:val="0"/>
                 <w:bCs w:val="0"/>
                 <w:sz w:val="22"/>
@@ -1916,6 +2219,7 @@
               <w:pStyle w:val="Rubrik"/>
               <w:jc w:val="left"/>
               <w:rPr>
+                <w:rFonts w:asciiTheme="majorBidi" w:hAnsiTheme="majorBidi" w:cstheme="majorBidi"/>
                 <w:b w:val="0"/>
                 <w:bCs w:val="0"/>
                 <w:sz w:val="22"/>
@@ -1926,6 +2230,7 @@
             <w:proofErr w:type="spellStart"/>
             <w:r>
               <w:rPr>
+                <w:rFonts w:asciiTheme="majorBidi" w:hAnsiTheme="majorBidi" w:cstheme="majorBidi"/>
                 <w:b w:val="0"/>
                 <w:bCs w:val="0"/>
                 <w:sz w:val="22"/>
@@ -1948,6 +2253,7 @@
               <w:pStyle w:val="Rubrik"/>
               <w:jc w:val="left"/>
               <w:rPr>
+                <w:rFonts w:asciiTheme="majorBidi" w:hAnsiTheme="majorBidi" w:cstheme="majorBidi"/>
                 <w:b w:val="0"/>
                 <w:bCs w:val="0"/>
                 <w:sz w:val="22"/>
@@ -1957,6 +2263,7 @@
             </w:pPr>
             <w:r>
               <w:rPr>
+                <w:rFonts w:asciiTheme="majorBidi" w:hAnsiTheme="majorBidi" w:cstheme="majorBidi"/>
                 <w:b w:val="0"/>
                 <w:bCs w:val="0"/>
                 <w:sz w:val="22"/>
@@ -1967,6 +2274,7 @@
             </w:r>
             <w:r>
               <w:rPr>
+                <w:rFonts w:asciiTheme="majorBidi" w:hAnsiTheme="majorBidi" w:cstheme="majorBidi"/>
                 <w:b w:val="0"/>
                 <w:bCs w:val="0"/>
                 <w:sz w:val="22"/>
@@ -1993,6 +2301,7 @@
               <w:pStyle w:val="Rubrik"/>
               <w:jc w:val="left"/>
               <w:rPr>
+                <w:rFonts w:asciiTheme="majorBidi" w:hAnsiTheme="majorBidi" w:cstheme="majorBidi"/>
                 <w:b w:val="0"/>
                 <w:bCs w:val="0"/>
                 <w:sz w:val="22"/>
@@ -2002,6 +2311,7 @@
             </w:pPr>
             <w:r>
               <w:rPr>
+                <w:rFonts w:asciiTheme="majorBidi" w:hAnsiTheme="majorBidi" w:cstheme="majorBidi"/>
                 <w:b w:val="0"/>
                 <w:bCs w:val="0"/>
                 <w:sz w:val="22"/>
@@ -2014,6 +2324,7 @@
             <w:proofErr w:type="spellStart"/>
             <w:r>
               <w:rPr>
+                <w:rFonts w:asciiTheme="majorBidi" w:hAnsiTheme="majorBidi" w:cstheme="majorBidi"/>
                 <w:b w:val="0"/>
                 <w:bCs w:val="0"/>
                 <w:sz w:val="22"/>
@@ -2025,6 +2336,7 @@
             <w:proofErr w:type="spellEnd"/>
             <w:r>
               <w:rPr>
+                <w:rFonts w:asciiTheme="majorBidi" w:hAnsiTheme="majorBidi" w:cstheme="majorBidi"/>
                 <w:b w:val="0"/>
                 <w:bCs w:val="0"/>
                 <w:sz w:val="22"/>
@@ -2036,6 +2348,7 @@
             <w:proofErr w:type="spellStart"/>
             <w:r>
               <w:rPr>
+                <w:rFonts w:asciiTheme="majorBidi" w:hAnsiTheme="majorBidi" w:cstheme="majorBidi"/>
                 <w:b w:val="0"/>
                 <w:bCs w:val="0"/>
                 <w:sz w:val="22"/>
@@ -2058,6 +2371,7 @@
               <w:pStyle w:val="Rubrik"/>
               <w:jc w:val="left"/>
               <w:rPr>
+                <w:rFonts w:asciiTheme="majorBidi" w:hAnsiTheme="majorBidi" w:cstheme="majorBidi"/>
                 <w:b w:val="0"/>
                 <w:bCs w:val="0"/>
                 <w:sz w:val="22"/>
@@ -2068,6 +2382,7 @@
             <w:proofErr w:type="spellStart"/>
             <w:r>
               <w:rPr>
+                <w:rFonts w:asciiTheme="majorBidi" w:hAnsiTheme="majorBidi" w:cstheme="majorBidi"/>
                 <w:b w:val="0"/>
                 <w:bCs w:val="0"/>
                 <w:sz w:val="22"/>
@@ -2090,6 +2405,7 @@
               <w:pStyle w:val="Rubrik"/>
               <w:jc w:val="left"/>
               <w:rPr>
+                <w:rFonts w:asciiTheme="majorBidi" w:hAnsiTheme="majorBidi" w:cstheme="majorBidi"/>
                 <w:b w:val="0"/>
                 <w:bCs w:val="0"/>
                 <w:sz w:val="22"/>
@@ -2099,6 +2415,7 @@
             </w:pPr>
             <w:r>
               <w:rPr>
+                <w:rFonts w:asciiTheme="majorBidi" w:hAnsiTheme="majorBidi" w:cstheme="majorBidi"/>
                 <w:b w:val="0"/>
                 <w:bCs w:val="0"/>
                 <w:sz w:val="22"/>
@@ -2109,6 +2426,7 @@
             </w:r>
             <w:r>
               <w:rPr>
+                <w:rFonts w:asciiTheme="majorBidi" w:hAnsiTheme="majorBidi" w:cstheme="majorBidi"/>
                 <w:b w:val="0"/>
                 <w:bCs w:val="0"/>
                 <w:sz w:val="22"/>
@@ -2135,6 +2453,7 @@
               <w:pStyle w:val="Rubrik"/>
               <w:jc w:val="left"/>
               <w:rPr>
+                <w:rFonts w:asciiTheme="majorBidi" w:hAnsiTheme="majorBidi" w:cstheme="majorBidi"/>
                 <w:b w:val="0"/>
                 <w:bCs w:val="0"/>
                 <w:sz w:val="22"/>
@@ -2144,6 +2463,7 @@
             </w:pPr>
             <w:r>
               <w:rPr>
+                <w:rFonts w:asciiTheme="majorBidi" w:hAnsiTheme="majorBidi" w:cstheme="majorBidi"/>
                 <w:b w:val="0"/>
                 <w:bCs w:val="0"/>
                 <w:sz w:val="22"/>
@@ -2155,6 +2475,7 @@
             <w:proofErr w:type="spellStart"/>
             <w:r>
               <w:rPr>
+                <w:rFonts w:asciiTheme="majorBidi" w:hAnsiTheme="majorBidi" w:cstheme="majorBidi"/>
                 <w:b w:val="0"/>
                 <w:bCs w:val="0"/>
                 <w:sz w:val="22"/>
@@ -2166,6 +2487,7 @@
             <w:proofErr w:type="spellEnd"/>
             <w:r>
               <w:rPr>
+                <w:rFonts w:asciiTheme="majorBidi" w:hAnsiTheme="majorBidi" w:cstheme="majorBidi"/>
                 <w:b w:val="0"/>
                 <w:bCs w:val="0"/>
                 <w:sz w:val="22"/>
@@ -2177,6 +2499,7 @@
             <w:proofErr w:type="spellStart"/>
             <w:r>
               <w:rPr>
+                <w:rFonts w:asciiTheme="majorBidi" w:hAnsiTheme="majorBidi" w:cstheme="majorBidi"/>
                 <w:b w:val="0"/>
                 <w:bCs w:val="0"/>
                 <w:sz w:val="22"/>
@@ -2188,6 +2511,7 @@
             <w:proofErr w:type="spellEnd"/>
             <w:r>
               <w:rPr>
+                <w:rFonts w:asciiTheme="majorBidi" w:hAnsiTheme="majorBidi" w:cstheme="majorBidi"/>
                 <w:b w:val="0"/>
                 <w:bCs w:val="0"/>
                 <w:sz w:val="22"/>
@@ -2199,6 +2523,7 @@
             <w:proofErr w:type="spellStart"/>
             <w:r>
               <w:rPr>
+                <w:rFonts w:asciiTheme="majorBidi" w:hAnsiTheme="majorBidi" w:cstheme="majorBidi"/>
                 <w:b w:val="0"/>
                 <w:bCs w:val="0"/>
                 <w:sz w:val="22"/>
@@ -2221,6 +2546,7 @@
               <w:pStyle w:val="Rubrik"/>
               <w:jc w:val="left"/>
               <w:rPr>
+                <w:rFonts w:asciiTheme="majorBidi" w:hAnsiTheme="majorBidi" w:cstheme="majorBidi"/>
                 <w:b w:val="0"/>
                 <w:bCs w:val="0"/>
                 <w:sz w:val="22"/>
@@ -2231,6 +2557,7 @@
             <w:proofErr w:type="spellStart"/>
             <w:r>
               <w:rPr>
+                <w:rFonts w:asciiTheme="majorBidi" w:hAnsiTheme="majorBidi" w:cstheme="majorBidi"/>
                 <w:b w:val="0"/>
                 <w:bCs w:val="0"/>
                 <w:sz w:val="22"/>
@@ -2253,6 +2580,7 @@
               <w:pStyle w:val="Rubrik"/>
               <w:jc w:val="left"/>
               <w:rPr>
+                <w:rFonts w:asciiTheme="majorBidi" w:hAnsiTheme="majorBidi" w:cstheme="majorBidi"/>
                 <w:b w:val="0"/>
                 <w:bCs w:val="0"/>
                 <w:sz w:val="22"/>
@@ -2262,6 +2590,7 @@
             </w:pPr>
             <w:r>
               <w:rPr>
+                <w:rFonts w:asciiTheme="majorBidi" w:hAnsiTheme="majorBidi" w:cstheme="majorBidi"/>
                 <w:b w:val="0"/>
                 <w:bCs w:val="0"/>
                 <w:sz w:val="22"/>
@@ -2272,6 +2601,7 @@
             </w:r>
             <w:r>
               <w:rPr>
+                <w:rFonts w:asciiTheme="majorBidi" w:hAnsiTheme="majorBidi" w:cstheme="majorBidi"/>
                 <w:b w:val="0"/>
                 <w:bCs w:val="0"/>
                 <w:sz w:val="22"/>
@@ -2298,6 +2628,7 @@
               <w:pStyle w:val="Rubrik"/>
               <w:jc w:val="left"/>
               <w:rPr>
+                <w:rFonts w:asciiTheme="majorBidi" w:hAnsiTheme="majorBidi" w:cstheme="majorBidi"/>
                 <w:b w:val="0"/>
                 <w:bCs w:val="0"/>
                 <w:sz w:val="22"/>
@@ -2307,6 +2638,7 @@
             </w:pPr>
             <w:r>
               <w:rPr>
+                <w:rFonts w:asciiTheme="majorBidi" w:hAnsiTheme="majorBidi" w:cstheme="majorBidi"/>
                 <w:b w:val="0"/>
                 <w:bCs w:val="0"/>
                 <w:sz w:val="22"/>
@@ -2318,6 +2650,7 @@
             <w:proofErr w:type="spellStart"/>
             <w:r>
               <w:rPr>
+                <w:rFonts w:asciiTheme="majorBidi" w:hAnsiTheme="majorBidi" w:cstheme="majorBidi"/>
                 <w:b w:val="0"/>
                 <w:bCs w:val="0"/>
                 <w:sz w:val="22"/>
@@ -2329,6 +2662,7 @@
             <w:proofErr w:type="spellEnd"/>
             <w:r>
               <w:rPr>
+                <w:rFonts w:asciiTheme="majorBidi" w:hAnsiTheme="majorBidi" w:cstheme="majorBidi"/>
                 <w:b w:val="0"/>
                 <w:bCs w:val="0"/>
                 <w:sz w:val="22"/>
@@ -2350,6 +2684,7 @@
               <w:pStyle w:val="Rubrik"/>
               <w:jc w:val="left"/>
               <w:rPr>
+                <w:rFonts w:asciiTheme="majorBidi" w:hAnsiTheme="majorBidi" w:cstheme="majorBidi"/>
                 <w:b w:val="0"/>
                 <w:bCs w:val="0"/>
                 <w:sz w:val="22"/>
@@ -2360,6 +2695,7 @@
             <w:proofErr w:type="spellStart"/>
             <w:r>
               <w:rPr>
+                <w:rFonts w:asciiTheme="majorBidi" w:hAnsiTheme="majorBidi" w:cstheme="majorBidi"/>
                 <w:b w:val="0"/>
                 <w:bCs w:val="0"/>
                 <w:sz w:val="22"/>
@@ -2382,6 +2718,7 @@
               <w:pStyle w:val="Rubrik"/>
               <w:jc w:val="left"/>
               <w:rPr>
+                <w:rFonts w:asciiTheme="majorBidi" w:hAnsiTheme="majorBidi" w:cstheme="majorBidi"/>
                 <w:b w:val="0"/>
                 <w:bCs w:val="0"/>
                 <w:sz w:val="22"/>
@@ -2391,6 +2728,7 @@
             </w:pPr>
             <w:r>
               <w:rPr>
+                <w:rFonts w:asciiTheme="majorBidi" w:hAnsiTheme="majorBidi" w:cstheme="majorBidi"/>
                 <w:b w:val="0"/>
                 <w:bCs w:val="0"/>
                 <w:sz w:val="22"/>
@@ -2401,6 +2739,7 @@
             </w:r>
             <w:r>
               <w:rPr>
+                <w:rFonts w:asciiTheme="majorBidi" w:hAnsiTheme="majorBidi" w:cstheme="majorBidi"/>
                 <w:b w:val="0"/>
                 <w:bCs w:val="0"/>
                 <w:sz w:val="22"/>
@@ -2427,6 +2766,7 @@
               <w:pStyle w:val="Rubrik"/>
               <w:jc w:val="left"/>
               <w:rPr>
+                <w:rFonts w:asciiTheme="majorBidi" w:hAnsiTheme="majorBidi" w:cstheme="majorBidi"/>
                 <w:b w:val="0"/>
                 <w:bCs w:val="0"/>
                 <w:sz w:val="22"/>
@@ -2436,6 +2776,7 @@
             </w:pPr>
             <w:r>
               <w:rPr>
+                <w:rFonts w:asciiTheme="majorBidi" w:hAnsiTheme="majorBidi" w:cstheme="majorBidi"/>
                 <w:b w:val="0"/>
                 <w:bCs w:val="0"/>
                 <w:sz w:val="22"/>
@@ -2447,6 +2788,7 @@
             <w:proofErr w:type="spellStart"/>
             <w:r>
               <w:rPr>
+                <w:rFonts w:asciiTheme="majorBidi" w:hAnsiTheme="majorBidi" w:cstheme="majorBidi"/>
                 <w:b w:val="0"/>
                 <w:bCs w:val="0"/>
                 <w:sz w:val="22"/>
@@ -2458,6 +2800,7 @@
             <w:proofErr w:type="spellEnd"/>
             <w:r>
               <w:rPr>
+                <w:rFonts w:asciiTheme="majorBidi" w:hAnsiTheme="majorBidi" w:cstheme="majorBidi"/>
                 <w:b w:val="0"/>
                 <w:bCs w:val="0"/>
                 <w:sz w:val="22"/>
@@ -2479,6 +2822,7 @@
               <w:pStyle w:val="Rubrik"/>
               <w:jc w:val="left"/>
               <w:rPr>
+                <w:rFonts w:asciiTheme="majorBidi" w:hAnsiTheme="majorBidi" w:cstheme="majorBidi"/>
                 <w:b w:val="0"/>
                 <w:bCs w:val="0"/>
                 <w:sz w:val="22"/>
@@ -2489,6 +2833,7 @@
             <w:proofErr w:type="spellStart"/>
             <w:r>
               <w:rPr>
+                <w:rFonts w:asciiTheme="majorBidi" w:hAnsiTheme="majorBidi" w:cstheme="majorBidi"/>
                 <w:b w:val="0"/>
                 <w:bCs w:val="0"/>
                 <w:sz w:val="22"/>
@@ -2511,6 +2856,7 @@
               <w:pStyle w:val="Rubrik"/>
               <w:jc w:val="left"/>
               <w:rPr>
+                <w:rFonts w:asciiTheme="majorBidi" w:hAnsiTheme="majorBidi" w:cstheme="majorBidi"/>
                 <w:b w:val="0"/>
                 <w:bCs w:val="0"/>
                 <w:sz w:val="22"/>
@@ -2520,6 +2866,7 @@
             </w:pPr>
             <w:r>
               <w:rPr>
+                <w:rFonts w:asciiTheme="majorBidi" w:hAnsiTheme="majorBidi" w:cstheme="majorBidi"/>
                 <w:b w:val="0"/>
                 <w:bCs w:val="0"/>
                 <w:sz w:val="22"/>
@@ -2530,6 +2877,7 @@
             </w:r>
             <w:r>
               <w:rPr>
+                <w:rFonts w:asciiTheme="majorBidi" w:hAnsiTheme="majorBidi" w:cstheme="majorBidi"/>
                 <w:b w:val="0"/>
                 <w:bCs w:val="0"/>
                 <w:sz w:val="22"/>
@@ -2556,6 +2904,7 @@
               <w:pStyle w:val="Rubrik"/>
               <w:jc w:val="left"/>
               <w:rPr>
+                <w:rFonts w:asciiTheme="majorBidi" w:hAnsiTheme="majorBidi" w:cstheme="majorBidi"/>
                 <w:b w:val="0"/>
                 <w:bCs w:val="0"/>
                 <w:sz w:val="22"/>
@@ -2565,6 +2914,7 @@
             </w:pPr>
             <w:r>
               <w:rPr>
+                <w:rFonts w:asciiTheme="majorBidi" w:hAnsiTheme="majorBidi" w:cstheme="majorBidi"/>
                 <w:b w:val="0"/>
                 <w:bCs w:val="0"/>
                 <w:sz w:val="22"/>
@@ -2576,6 +2926,7 @@
             <w:proofErr w:type="spellStart"/>
             <w:r>
               <w:rPr>
+                <w:rFonts w:asciiTheme="majorBidi" w:hAnsiTheme="majorBidi" w:cstheme="majorBidi"/>
                 <w:b w:val="0"/>
                 <w:bCs w:val="0"/>
                 <w:sz w:val="22"/>
@@ -2587,6 +2938,7 @@
             <w:proofErr w:type="spellEnd"/>
             <w:r>
               <w:rPr>
+                <w:rFonts w:asciiTheme="majorBidi" w:hAnsiTheme="majorBidi" w:cstheme="majorBidi"/>
                 <w:b w:val="0"/>
                 <w:bCs w:val="0"/>
                 <w:sz w:val="22"/>
@@ -2598,6 +2950,7 @@
             <w:proofErr w:type="spellStart"/>
             <w:r>
               <w:rPr>
+                <w:rFonts w:asciiTheme="majorBidi" w:hAnsiTheme="majorBidi" w:cstheme="majorBidi"/>
                 <w:b w:val="0"/>
                 <w:bCs w:val="0"/>
                 <w:sz w:val="22"/>
@@ -2609,6 +2962,7 @@
             <w:proofErr w:type="spellEnd"/>
             <w:r>
               <w:rPr>
+                <w:rFonts w:asciiTheme="majorBidi" w:hAnsiTheme="majorBidi" w:cstheme="majorBidi"/>
                 <w:b w:val="0"/>
                 <w:bCs w:val="0"/>
                 <w:sz w:val="22"/>
@@ -2630,6 +2984,7 @@
               <w:pStyle w:val="Rubrik"/>
               <w:jc w:val="left"/>
               <w:rPr>
+                <w:rFonts w:asciiTheme="majorBidi" w:hAnsiTheme="majorBidi" w:cstheme="majorBidi"/>
                 <w:b w:val="0"/>
                 <w:bCs w:val="0"/>
                 <w:sz w:val="22"/>
@@ -2640,6 +2995,7 @@
             <w:proofErr w:type="spellStart"/>
             <w:r>
               <w:rPr>
+                <w:rFonts w:asciiTheme="majorBidi" w:hAnsiTheme="majorBidi" w:cstheme="majorBidi"/>
                 <w:b w:val="0"/>
                 <w:bCs w:val="0"/>
                 <w:sz w:val="22"/>
@@ -2662,6 +3018,7 @@
               <w:pStyle w:val="Rubrik"/>
               <w:jc w:val="left"/>
               <w:rPr>
+                <w:rFonts w:asciiTheme="majorBidi" w:hAnsiTheme="majorBidi" w:cstheme="majorBidi"/>
                 <w:b w:val="0"/>
                 <w:bCs w:val="0"/>
                 <w:sz w:val="22"/>
@@ -2671,6 +3028,7 @@
             </w:pPr>
             <w:r>
               <w:rPr>
+                <w:rFonts w:asciiTheme="majorBidi" w:hAnsiTheme="majorBidi" w:cstheme="majorBidi"/>
                 <w:b w:val="0"/>
                 <w:bCs w:val="0"/>
                 <w:sz w:val="22"/>
@@ -2681,6 +3039,7 @@
             </w:r>
             <w:r>
               <w:rPr>
+                <w:rFonts w:asciiTheme="majorBidi" w:hAnsiTheme="majorBidi" w:cstheme="majorBidi"/>
                 <w:b w:val="0"/>
                 <w:bCs w:val="0"/>
                 <w:sz w:val="22"/>
@@ -2707,6 +3066,7 @@
               <w:pStyle w:val="Rubrik"/>
               <w:jc w:val="left"/>
               <w:rPr>
+                <w:rFonts w:asciiTheme="majorBidi" w:hAnsiTheme="majorBidi" w:cstheme="majorBidi"/>
                 <w:b w:val="0"/>
                 <w:bCs w:val="0"/>
                 <w:sz w:val="22"/>
@@ -2716,6 +3076,7 @@
             </w:pPr>
             <w:r>
               <w:rPr>
+                <w:rFonts w:asciiTheme="majorBidi" w:hAnsiTheme="majorBidi" w:cstheme="majorBidi"/>
                 <w:b w:val="0"/>
                 <w:bCs w:val="0"/>
                 <w:sz w:val="22"/>
@@ -2727,6 +3088,7 @@
             <w:proofErr w:type="spellStart"/>
             <w:r>
               <w:rPr>
+                <w:rFonts w:asciiTheme="majorBidi" w:hAnsiTheme="majorBidi" w:cstheme="majorBidi"/>
                 <w:b w:val="0"/>
                 <w:bCs w:val="0"/>
                 <w:sz w:val="22"/>
@@ -2738,6 +3100,7 @@
             <w:proofErr w:type="spellEnd"/>
             <w:r>
               <w:rPr>
+                <w:rFonts w:asciiTheme="majorBidi" w:hAnsiTheme="majorBidi" w:cstheme="majorBidi"/>
                 <w:b w:val="0"/>
                 <w:bCs w:val="0"/>
                 <w:sz w:val="22"/>
@@ -2759,6 +3122,7 @@
               <w:pStyle w:val="Rubrik"/>
               <w:jc w:val="left"/>
               <w:rPr>
+                <w:rFonts w:asciiTheme="majorBidi" w:hAnsiTheme="majorBidi" w:cstheme="majorBidi"/>
                 <w:b w:val="0"/>
                 <w:bCs w:val="0"/>
                 <w:sz w:val="22"/>
@@ -2769,6 +3133,7 @@
             <w:proofErr w:type="spellStart"/>
             <w:r>
               <w:rPr>
+                <w:rFonts w:asciiTheme="majorBidi" w:hAnsiTheme="majorBidi" w:cstheme="majorBidi"/>
                 <w:b w:val="0"/>
                 <w:bCs w:val="0"/>
                 <w:sz w:val="22"/>
@@ -2791,6 +3156,7 @@
               <w:pStyle w:val="Rubrik"/>
               <w:jc w:val="left"/>
               <w:rPr>
+                <w:rFonts w:asciiTheme="majorBidi" w:hAnsiTheme="majorBidi" w:cstheme="majorBidi"/>
                 <w:b w:val="0"/>
                 <w:bCs w:val="0"/>
                 <w:sz w:val="22"/>
@@ -2800,6 +3166,7 @@
             </w:pPr>
             <w:r>
               <w:rPr>
+                <w:rFonts w:asciiTheme="majorBidi" w:hAnsiTheme="majorBidi" w:cstheme="majorBidi"/>
                 <w:b w:val="0"/>
                 <w:bCs w:val="0"/>
                 <w:sz w:val="22"/>
@@ -2826,6 +3193,7 @@
               <w:pStyle w:val="Rubrik"/>
               <w:jc w:val="left"/>
               <w:rPr>
+                <w:rFonts w:asciiTheme="majorBidi" w:hAnsiTheme="majorBidi" w:cstheme="majorBidi"/>
                 <w:b w:val="0"/>
                 <w:bCs w:val="0"/>
                 <w:sz w:val="22"/>
@@ -2835,6 +3203,7 @@
             </w:pPr>
             <w:r>
               <w:rPr>
+                <w:rFonts w:asciiTheme="majorBidi" w:hAnsiTheme="majorBidi" w:cstheme="majorBidi"/>
                 <w:b w:val="0"/>
                 <w:bCs w:val="0"/>
                 <w:sz w:val="22"/>
@@ -2846,6 +3215,7 @@
             <w:proofErr w:type="spellStart"/>
             <w:r>
               <w:rPr>
+                <w:rFonts w:asciiTheme="majorBidi" w:hAnsiTheme="majorBidi" w:cstheme="majorBidi"/>
                 <w:b w:val="0"/>
                 <w:bCs w:val="0"/>
                 <w:sz w:val="22"/>
@@ -2857,6 +3227,7 @@
             <w:proofErr w:type="spellEnd"/>
             <w:r>
               <w:rPr>
+                <w:rFonts w:asciiTheme="majorBidi" w:hAnsiTheme="majorBidi" w:cstheme="majorBidi"/>
                 <w:b w:val="0"/>
                 <w:bCs w:val="0"/>
                 <w:sz w:val="22"/>
@@ -2868,6 +3239,7 @@
             <w:proofErr w:type="spellStart"/>
             <w:r>
               <w:rPr>
+                <w:rFonts w:asciiTheme="majorBidi" w:hAnsiTheme="majorBidi" w:cstheme="majorBidi"/>
                 <w:b w:val="0"/>
                 <w:bCs w:val="0"/>
                 <w:sz w:val="22"/>
@@ -2879,6 +3251,7 @@
             <w:proofErr w:type="spellEnd"/>
             <w:r>
               <w:rPr>
+                <w:rFonts w:asciiTheme="majorBidi" w:hAnsiTheme="majorBidi" w:cstheme="majorBidi"/>
                 <w:b w:val="0"/>
                 <w:bCs w:val="0"/>
                 <w:sz w:val="22"/>
@@ -2900,6 +3273,7 @@
               <w:pStyle w:val="Rubrik"/>
               <w:jc w:val="left"/>
               <w:rPr>
+                <w:rFonts w:asciiTheme="majorBidi" w:hAnsiTheme="majorBidi" w:cstheme="majorBidi"/>
                 <w:b w:val="0"/>
                 <w:bCs w:val="0"/>
                 <w:sz w:val="22"/>
@@ -2910,6 +3284,7 @@
             <w:proofErr w:type="spellStart"/>
             <w:r>
               <w:rPr>
+                <w:rFonts w:asciiTheme="majorBidi" w:hAnsiTheme="majorBidi" w:cstheme="majorBidi"/>
                 <w:b w:val="0"/>
                 <w:bCs w:val="0"/>
                 <w:sz w:val="22"/>
@@ -2932,6 +3307,7 @@
               <w:pStyle w:val="Rubrik"/>
               <w:jc w:val="left"/>
               <w:rPr>
+                <w:rFonts w:asciiTheme="majorBidi" w:hAnsiTheme="majorBidi" w:cstheme="majorBidi"/>
                 <w:b w:val="0"/>
                 <w:bCs w:val="0"/>
                 <w:sz w:val="22"/>
@@ -2941,6 +3317,7 @@
             </w:pPr>
             <w:r>
               <w:rPr>
+                <w:rFonts w:asciiTheme="majorBidi" w:hAnsiTheme="majorBidi" w:cstheme="majorBidi"/>
                 <w:b w:val="0"/>
                 <w:bCs w:val="0"/>
                 <w:sz w:val="22"/>
@@ -2951,6 +3328,7 @@
             </w:r>
             <w:r>
               <w:rPr>
+                <w:rFonts w:asciiTheme="majorBidi" w:hAnsiTheme="majorBidi" w:cstheme="majorBidi"/>
                 <w:b w:val="0"/>
                 <w:bCs w:val="0"/>
                 <w:sz w:val="22"/>
@@ -2967,43 +3345,76 @@
       <w:pPr>
         <w:pStyle w:val="Rubrik"/>
         <w:jc w:val="left"/>
+        <w:rPr>
+          <w:rFonts w:asciiTheme="majorBidi" w:hAnsiTheme="majorBidi" w:cstheme="majorBidi"/>
+        </w:rPr>
       </w:pPr>
     </w:p>
     <w:p>
       <w:pPr>
         <w:pStyle w:val="Rubrik"/>
+        <w:rPr>
+          <w:rFonts w:asciiTheme="majorBidi" w:hAnsiTheme="majorBidi" w:cstheme="majorBidi"/>
+        </w:rPr>
       </w:pPr>
     </w:p>
     <w:p>
       <w:pPr>
         <w:pStyle w:val="Rubrik"/>
+        <w:rPr>
+          <w:rFonts w:asciiTheme="majorBidi" w:hAnsiTheme="majorBidi" w:cstheme="majorBidi"/>
+        </w:rPr>
       </w:pPr>
     </w:p>
     <w:p>
       <w:pPr>
         <w:pStyle w:val="Rubrik1"/>
+        <w:rPr>
+          <w:rFonts w:asciiTheme="majorBidi" w:hAnsiTheme="majorBidi" w:cstheme="majorBidi"/>
+        </w:rPr>
       </w:pPr>
       <w:bookmarkStart w:id="3" w:name="_Toc236043814"/>
       <w:r>
+        <w:rPr>
+          <w:rFonts w:asciiTheme="majorBidi" w:hAnsiTheme="majorBidi" w:cstheme="majorBidi"/>
+        </w:rPr>
         <w:t>Requirements Descriptions</w:t>
       </w:r>
       <w:bookmarkEnd w:id="3"/>
     </w:p>
-    <w:p/>
+    <w:p>
+      <w:pPr>
+        <w:rPr>
+          <w:rFonts w:asciiTheme="majorBidi" w:hAnsiTheme="majorBidi" w:cstheme="majorBidi"/>
+        </w:rPr>
+      </w:pPr>
+    </w:p>
     <w:p>
       <w:pPr>
         <w:pStyle w:val="Rubrik2"/>
+        <w:rPr>
+          <w:rFonts w:asciiTheme="majorBidi" w:hAnsiTheme="majorBidi" w:cstheme="majorBidi"/>
+        </w:rPr>
       </w:pPr>
       <w:bookmarkStart w:id="4" w:name="_Toc236043815"/>
       <w:r>
+        <w:rPr>
+          <w:rFonts w:asciiTheme="majorBidi" w:hAnsiTheme="majorBidi" w:cstheme="majorBidi"/>
+        </w:rPr>
         <w:t xml:space="preserve">R1: </w:t>
       </w:r>
       <w:proofErr w:type="spellStart"/>
       <w:r>
+        <w:rPr>
+          <w:rFonts w:asciiTheme="majorBidi" w:hAnsiTheme="majorBidi" w:cstheme="majorBidi"/>
+        </w:rPr>
         <w:t>Wokwi</w:t>
       </w:r>
       <w:proofErr w:type="spellEnd"/>
       <w:r>
+        <w:rPr>
+          <w:rFonts w:asciiTheme="majorBidi" w:hAnsiTheme="majorBidi" w:cstheme="majorBidi"/>
+        </w:rPr>
         <w:t xml:space="preserve"> Device Simulation</w:t>
       </w:r>
       <w:bookmarkEnd w:id="4"/>
@@ -3011,12 +3422,14 @@
     <w:p>
       <w:pPr>
         <w:rPr>
+          <w:rFonts w:asciiTheme="majorBidi" w:hAnsiTheme="majorBidi" w:cstheme="majorBidi"/>
           <w:sz w:val="22"/>
           <w:szCs w:val="22"/>
         </w:rPr>
       </w:pPr>
       <w:r>
         <w:rPr>
+          <w:rFonts w:asciiTheme="majorBidi" w:hAnsiTheme="majorBidi" w:cstheme="majorBidi"/>
           <w:sz w:val="22"/>
           <w:szCs w:val="22"/>
         </w:rPr>
@@ -3025,6 +3438,7 @@
       <w:proofErr w:type="spellStart"/>
       <w:r>
         <w:rPr>
+          <w:rFonts w:asciiTheme="majorBidi" w:hAnsiTheme="majorBidi" w:cstheme="majorBidi"/>
           <w:sz w:val="22"/>
           <w:szCs w:val="22"/>
         </w:rPr>
@@ -3033,6 +3447,7 @@
       <w:proofErr w:type="spellEnd"/>
       <w:r>
         <w:rPr>
+          <w:rFonts w:asciiTheme="majorBidi" w:hAnsiTheme="majorBidi" w:cstheme="majorBidi"/>
           <w:sz w:val="22"/>
           <w:szCs w:val="22"/>
         </w:rPr>
@@ -3042,6 +3457,7 @@
     <w:p>
       <w:pPr>
         <w:rPr>
+          <w:rFonts w:asciiTheme="majorBidi" w:hAnsiTheme="majorBidi" w:cstheme="majorBidi"/>
           <w:sz w:val="22"/>
           <w:szCs w:val="22"/>
         </w:rPr>
@@ -3050,9 +3466,15 @@
     <w:p>
       <w:pPr>
         <w:pStyle w:val="Rubrik2"/>
+        <w:rPr>
+          <w:rFonts w:asciiTheme="majorBidi" w:hAnsiTheme="majorBidi" w:cstheme="majorBidi"/>
+        </w:rPr>
       </w:pPr>
       <w:bookmarkStart w:id="5" w:name="_Toc236043816"/>
       <w:r>
+        <w:rPr>
+          <w:rFonts w:asciiTheme="majorBidi" w:hAnsiTheme="majorBidi" w:cstheme="majorBidi"/>
+        </w:rPr>
         <w:t>R2: Wi-Fi and Backend Connection</w:t>
       </w:r>
       <w:bookmarkEnd w:id="5"/>
@@ -3060,12 +3482,14 @@
     <w:p>
       <w:pPr>
         <w:rPr>
+          <w:rFonts w:asciiTheme="majorBidi" w:hAnsiTheme="majorBidi" w:cstheme="majorBidi"/>
           <w:sz w:val="22"/>
           <w:szCs w:val="22"/>
         </w:rPr>
       </w:pPr>
       <w:r>
         <w:rPr>
+          <w:rFonts w:asciiTheme="majorBidi" w:hAnsiTheme="majorBidi" w:cstheme="majorBidi"/>
           <w:sz w:val="22"/>
           <w:szCs w:val="22"/>
         </w:rPr>
@@ -3074,6 +3498,7 @@
       <w:proofErr w:type="spellStart"/>
       <w:r>
         <w:rPr>
+          <w:rFonts w:asciiTheme="majorBidi" w:hAnsiTheme="majorBidi" w:cstheme="majorBidi"/>
           <w:sz w:val="22"/>
           <w:szCs w:val="22"/>
         </w:rPr>
@@ -3082,6 +3507,7 @@
       <w:proofErr w:type="spellEnd"/>
       <w:r>
         <w:rPr>
+          <w:rFonts w:asciiTheme="majorBidi" w:hAnsiTheme="majorBidi" w:cstheme="majorBidi"/>
           <w:sz w:val="22"/>
           <w:szCs w:val="22"/>
         </w:rPr>
@@ -3090,6 +3516,7 @@
       <w:proofErr w:type="spellStart"/>
       <w:r>
         <w:rPr>
+          <w:rFonts w:asciiTheme="majorBidi" w:hAnsiTheme="majorBidi" w:cstheme="majorBidi"/>
           <w:sz w:val="22"/>
           <w:szCs w:val="22"/>
         </w:rPr>
@@ -3098,6 +3525,7 @@
       <w:proofErr w:type="spellEnd"/>
       <w:r>
         <w:rPr>
+          <w:rFonts w:asciiTheme="majorBidi" w:hAnsiTheme="majorBidi" w:cstheme="majorBidi"/>
           <w:sz w:val="22"/>
           <w:szCs w:val="22"/>
         </w:rPr>
@@ -3107,12 +3535,14 @@
     <w:p>
       <w:pPr>
         <w:rPr>
+          <w:rFonts w:asciiTheme="majorBidi" w:hAnsiTheme="majorBidi" w:cstheme="majorBidi"/>
           <w:sz w:val="22"/>
           <w:szCs w:val="22"/>
         </w:rPr>
       </w:pPr>
       <w:r>
         <w:rPr>
+          <w:rFonts w:asciiTheme="majorBidi" w:hAnsiTheme="majorBidi" w:cstheme="majorBidi"/>
           <w:sz w:val="22"/>
           <w:szCs w:val="22"/>
         </w:rPr>
@@ -3121,6 +3551,7 @@
       <w:proofErr w:type="spellStart"/>
       <w:r>
         <w:rPr>
+          <w:rFonts w:asciiTheme="majorBidi" w:hAnsiTheme="majorBidi" w:cstheme="majorBidi"/>
           <w:sz w:val="22"/>
           <w:szCs w:val="22"/>
         </w:rPr>
@@ -3129,6 +3560,7 @@
       <w:proofErr w:type="spellEnd"/>
       <w:r>
         <w:rPr>
+          <w:rFonts w:asciiTheme="majorBidi" w:hAnsiTheme="majorBidi" w:cstheme="majorBidi"/>
           <w:sz w:val="22"/>
           <w:szCs w:val="22"/>
         </w:rPr>
@@ -3138,6 +3570,7 @@
     <w:p>
       <w:pPr>
         <w:rPr>
+          <w:rFonts w:asciiTheme="majorBidi" w:hAnsiTheme="majorBidi" w:cstheme="majorBidi"/>
           <w:sz w:val="22"/>
           <w:szCs w:val="22"/>
         </w:rPr>
@@ -3146,34 +3579,72 @@
     <w:p>
       <w:pPr>
         <w:pStyle w:val="Rubrik2"/>
+        <w:rPr>
+          <w:rFonts w:asciiTheme="majorBidi" w:hAnsiTheme="majorBidi" w:cstheme="majorBidi"/>
+        </w:rPr>
       </w:pPr>
       <w:bookmarkStart w:id="6" w:name="_Toc236043817"/>
       <w:r>
+        <w:rPr>
+          <w:rFonts w:asciiTheme="majorBidi" w:hAnsiTheme="majorBidi" w:cstheme="majorBidi"/>
+        </w:rPr>
         <w:t>R3: Device Registration</w:t>
       </w:r>
       <w:bookmarkEnd w:id="6"/>
     </w:p>
     <w:p>
+      <w:pPr>
+        <w:rPr>
+          <w:rFonts w:asciiTheme="majorBidi" w:hAnsiTheme="majorBidi" w:cstheme="majorBidi"/>
+        </w:rPr>
+      </w:pPr>
       <w:r>
+        <w:rPr>
+          <w:rFonts w:asciiTheme="majorBidi" w:hAnsiTheme="majorBidi" w:cstheme="majorBidi"/>
+        </w:rPr>
         <w:t>Each simulated device shall register with the backend exactly once by sending a unique ID, device name, valid device type, and initial state to the /</w:t>
       </w:r>
       <w:proofErr w:type="spellStart"/>
       <w:r>
+        <w:rPr>
+          <w:rFonts w:asciiTheme="majorBidi" w:hAnsiTheme="majorBidi" w:cstheme="majorBidi"/>
+        </w:rPr>
         <w:t>api</w:t>
       </w:r>
       <w:proofErr w:type="spellEnd"/>
       <w:r>
+        <w:rPr>
+          <w:rFonts w:asciiTheme="majorBidi" w:hAnsiTheme="majorBidi" w:cstheme="majorBidi"/>
+        </w:rPr>
         <w:t>/devices/register endpoint. The device shall store the secret returned by the backend.</w:t>
       </w:r>
     </w:p>
-    <w:p/>
-    <w:p/>
+    <w:p>
+      <w:pPr>
+        <w:rPr>
+          <w:rFonts w:asciiTheme="majorBidi" w:hAnsiTheme="majorBidi" w:cstheme="majorBidi"/>
+        </w:rPr>
+      </w:pPr>
+    </w:p>
+    <w:p>
+      <w:pPr>
+        <w:rPr>
+          <w:rFonts w:asciiTheme="majorBidi" w:hAnsiTheme="majorBidi" w:cstheme="majorBidi"/>
+        </w:rPr>
+      </w:pPr>
+    </w:p>
     <w:p>
       <w:pPr>
         <w:pStyle w:val="Rubrik2"/>
+        <w:rPr>
+          <w:rFonts w:asciiTheme="majorBidi" w:hAnsiTheme="majorBidi" w:cstheme="majorBidi"/>
+        </w:rPr>
       </w:pPr>
       <w:bookmarkStart w:id="7" w:name="_Toc236043818"/>
       <w:r>
+        <w:rPr>
+          <w:rFonts w:asciiTheme="majorBidi" w:hAnsiTheme="majorBidi" w:cstheme="majorBidi"/>
+        </w:rPr>
         <w:t>R4: Device Secret Authentication</w:t>
       </w:r>
       <w:bookmarkEnd w:id="7"/>
@@ -3181,12 +3652,14 @@
     <w:p>
       <w:pPr>
         <w:rPr>
+          <w:rFonts w:asciiTheme="majorBidi" w:hAnsiTheme="majorBidi" w:cstheme="majorBidi"/>
           <w:sz w:val="22"/>
           <w:szCs w:val="22"/>
         </w:rPr>
       </w:pPr>
       <w:r>
         <w:rPr>
+          <w:rFonts w:asciiTheme="majorBidi" w:hAnsiTheme="majorBidi" w:cstheme="majorBidi"/>
           <w:sz w:val="22"/>
           <w:szCs w:val="22"/>
         </w:rPr>
@@ -3196,14 +3669,23 @@
     <w:p>
       <w:pPr>
         <w:spacing w:after="240"/>
+        <w:rPr>
+          <w:rFonts w:asciiTheme="majorBidi" w:hAnsiTheme="majorBidi" w:cstheme="majorBidi"/>
+        </w:rPr>
       </w:pPr>
     </w:p>
     <w:p>
       <w:pPr>
         <w:pStyle w:val="Rubrik2"/>
+        <w:rPr>
+          <w:rFonts w:asciiTheme="majorBidi" w:hAnsiTheme="majorBidi" w:cstheme="majorBidi"/>
+        </w:rPr>
       </w:pPr>
       <w:bookmarkStart w:id="8" w:name="_Toc236043819"/>
       <w:r>
+        <w:rPr>
+          <w:rFonts w:asciiTheme="majorBidi" w:hAnsiTheme="majorBidi" w:cstheme="majorBidi"/>
+        </w:rPr>
         <w:t>R5: Device Heartbeat</w:t>
       </w:r>
       <w:bookmarkEnd w:id="8"/>
@@ -3211,30 +3693,51 @@
     <w:p>
       <w:pPr>
         <w:spacing w:after="240"/>
+        <w:rPr>
+          <w:rFonts w:asciiTheme="majorBidi" w:hAnsiTheme="majorBidi" w:cstheme="majorBidi"/>
+        </w:rPr>
       </w:pPr>
       <w:r>
+        <w:rPr>
+          <w:rFonts w:asciiTheme="majorBidi" w:hAnsiTheme="majorBidi" w:cstheme="majorBidi"/>
+        </w:rPr>
         <w:t>Each registered device shall send a heartbeat request to the /</w:t>
       </w:r>
       <w:proofErr w:type="spellStart"/>
       <w:r>
+        <w:rPr>
+          <w:rFonts w:asciiTheme="majorBidi" w:hAnsiTheme="majorBidi" w:cstheme="majorBidi"/>
+        </w:rPr>
         <w:t>api</w:t>
       </w:r>
       <w:proofErr w:type="spellEnd"/>
       <w:r>
+        <w:rPr>
+          <w:rFonts w:asciiTheme="majorBidi" w:hAnsiTheme="majorBidi" w:cstheme="majorBidi"/>
+        </w:rPr>
         <w:t>/devices/heartbeat endpoint every 30 seconds. The request shall contain the device ID and secret so that the backend can determine whether the device is online or offline.</w:t>
       </w:r>
     </w:p>
     <w:p>
       <w:pPr>
         <w:spacing w:after="240"/>
+        <w:rPr>
+          <w:rFonts w:asciiTheme="majorBidi" w:hAnsiTheme="majorBidi" w:cstheme="majorBidi"/>
+        </w:rPr>
       </w:pPr>
     </w:p>
     <w:p>
       <w:pPr>
         <w:pStyle w:val="Rubrik2"/>
+        <w:rPr>
+          <w:rFonts w:asciiTheme="majorBidi" w:hAnsiTheme="majorBidi" w:cstheme="majorBidi"/>
+        </w:rPr>
       </w:pPr>
       <w:bookmarkStart w:id="9" w:name="_Toc236043820"/>
       <w:r>
+        <w:rPr>
+          <w:rFonts w:asciiTheme="majorBidi" w:hAnsiTheme="majorBidi" w:cstheme="majorBidi"/>
+        </w:rPr>
         <w:t>R6: Device State Management</w:t>
       </w:r>
       <w:bookmarkEnd w:id="9"/>
@@ -3242,65 +3745,142 @@
     <w:p>
       <w:pPr>
         <w:spacing w:after="240"/>
+        <w:rPr>
+          <w:rFonts w:asciiTheme="majorBidi" w:hAnsiTheme="majorBidi" w:cstheme="majorBidi"/>
+        </w:rPr>
       </w:pPr>
       <w:r>
+        <w:rPr>
+          <w:rFonts w:asciiTheme="majorBidi" w:hAnsiTheme="majorBidi" w:cstheme="majorBidi"/>
+        </w:rPr>
         <w:t>Each simulated device shall maintain only the state fields relevant to its device type. Examples include power and brightness for lights, open status for doors and windows, speed for fans, temperature for temperature sensors, motion status for motion sensors, and active status for alarms.</w:t>
       </w:r>
     </w:p>
     <w:p>
       <w:pPr>
         <w:spacing w:after="240"/>
+        <w:rPr>
+          <w:rFonts w:asciiTheme="majorBidi" w:hAnsiTheme="majorBidi" w:cstheme="majorBidi"/>
+        </w:rPr>
       </w:pPr>
     </w:p>
     <w:p>
       <w:pPr>
         <w:pStyle w:val="Rubrik2"/>
+        <w:rPr>
+          <w:rFonts w:asciiTheme="majorBidi" w:hAnsiTheme="majorBidi" w:cstheme="majorBidi"/>
+        </w:rPr>
       </w:pPr>
       <w:bookmarkStart w:id="10" w:name="_Toc236043821"/>
       <w:r>
+        <w:rPr>
+          <w:rFonts w:asciiTheme="majorBidi" w:hAnsiTheme="majorBidi" w:cstheme="majorBidi"/>
+        </w:rPr>
         <w:t>R7: Backend Command Handling</w:t>
       </w:r>
       <w:bookmarkEnd w:id="10"/>
     </w:p>
     <w:p>
+      <w:pPr>
+        <w:rPr>
+          <w:rFonts w:asciiTheme="majorBidi" w:hAnsiTheme="majorBidi" w:cstheme="majorBidi"/>
+        </w:rPr>
+      </w:pPr>
       <w:r>
+        <w:rPr>
+          <w:rFonts w:asciiTheme="majorBidi" w:hAnsiTheme="majorBidi" w:cstheme="majorBidi"/>
+        </w:rPr>
         <w:t>The IoT subsystem shall retrieve desired device states from the backend and apply the received states to the corresponding simulated hardware.</w:t>
       </w:r>
     </w:p>
-    <w:p/>
     <w:p>
+      <w:pPr>
+        <w:rPr>
+          <w:rFonts w:asciiTheme="majorBidi" w:hAnsiTheme="majorBidi" w:cstheme="majorBidi"/>
+        </w:rPr>
+      </w:pPr>
+    </w:p>
+    <w:p>
+      <w:pPr>
+        <w:rPr>
+          <w:rFonts w:asciiTheme="majorBidi" w:hAnsiTheme="majorBidi" w:cstheme="majorBidi"/>
+        </w:rPr>
+      </w:pPr>
       <w:r>
+        <w:rPr>
+          <w:rFonts w:asciiTheme="majorBidi" w:hAnsiTheme="majorBidi" w:cstheme="majorBidi"/>
+        </w:rPr>
         <w:t>Implementation status: Implemented and successfully tested using simulated GET /devices/states responses. Desired states are received every 3 seconds and applied to the simulated hardware.</w:t>
       </w:r>
     </w:p>
-    <w:p/>
+    <w:p>
+      <w:pPr>
+        <w:rPr>
+          <w:rFonts w:asciiTheme="majorBidi" w:hAnsiTheme="majorBidi" w:cstheme="majorBidi"/>
+        </w:rPr>
+      </w:pPr>
+    </w:p>
     <w:p>
       <w:pPr>
         <w:pStyle w:val="Rubrik2"/>
+        <w:rPr>
+          <w:rFonts w:asciiTheme="majorBidi" w:hAnsiTheme="majorBidi" w:cstheme="majorBidi"/>
+        </w:rPr>
       </w:pPr>
       <w:bookmarkStart w:id="11" w:name="_Toc236043822"/>
       <w:r>
+        <w:rPr>
+          <w:rFonts w:asciiTheme="majorBidi" w:hAnsiTheme="majorBidi" w:cstheme="majorBidi"/>
+        </w:rPr>
         <w:t>R8: Device State Reporting</w:t>
       </w:r>
       <w:bookmarkEnd w:id="11"/>
     </w:p>
     <w:p>
+      <w:pPr>
+        <w:rPr>
+          <w:rFonts w:asciiTheme="majorBidi" w:hAnsiTheme="majorBidi" w:cstheme="majorBidi"/>
+        </w:rPr>
+      </w:pPr>
       <w:r>
+        <w:rPr>
+          <w:rFonts w:asciiTheme="majorBidi" w:hAnsiTheme="majorBidi" w:cstheme="majorBidi"/>
+        </w:rPr>
         <w:t>The IoT subsystem shall report relevant sensor and device state changes to the backend.</w:t>
       </w:r>
     </w:p>
-    <w:p/>
     <w:p>
+      <w:pPr>
+        <w:rPr>
+          <w:rFonts w:asciiTheme="majorBidi" w:hAnsiTheme="majorBidi" w:cstheme="majorBidi"/>
+        </w:rPr>
+      </w:pPr>
+    </w:p>
+    <w:p>
+      <w:pPr>
+        <w:rPr>
+          <w:rFonts w:asciiTheme="majorBidi" w:hAnsiTheme="majorBidi" w:cstheme="majorBidi"/>
+        </w:rPr>
+      </w:pPr>
       <w:r>
+        <w:rPr>
+          <w:rFonts w:asciiTheme="majorBidi" w:hAnsiTheme="majorBidi" w:cstheme="majorBidi"/>
+        </w:rPr>
         <w:t>Implementation status: Not implemented because no backend endpoint for reporting sensor/device states is currently available.</w:t>
       </w:r>
     </w:p>
     <w:p>
       <w:pPr>
         <w:pStyle w:val="Rubrik2"/>
+        <w:rPr>
+          <w:rFonts w:asciiTheme="majorBidi" w:hAnsiTheme="majorBidi" w:cstheme="majorBidi"/>
+        </w:rPr>
       </w:pPr>
       <w:bookmarkStart w:id="12" w:name="_Toc236043823"/>
       <w:r>
+        <w:rPr>
+          <w:rFonts w:asciiTheme="majorBidi" w:hAnsiTheme="majorBidi" w:cstheme="majorBidi"/>
+        </w:rPr>
         <w:t>R9: Multiple Device Support</w:t>
       </w:r>
       <w:bookmarkEnd w:id="12"/>
@@ -3308,41 +3888,86 @@
     <w:p>
       <w:pPr>
         <w:spacing w:after="240"/>
+        <w:rPr>
+          <w:rFonts w:asciiTheme="majorBidi" w:hAnsiTheme="majorBidi" w:cstheme="majorBidi"/>
+        </w:rPr>
       </w:pPr>
       <w:r>
+        <w:rPr>
+          <w:rFonts w:asciiTheme="majorBidi" w:hAnsiTheme="majorBidi" w:cstheme="majorBidi"/>
+        </w:rPr>
         <w:t xml:space="preserve">The IoT subsystem shall support at least 10 simulated smart-home devices. The devices may use the supported backend types: light, door, fan, </w:t>
       </w:r>
       <w:proofErr w:type="spellStart"/>
       <w:r>
+        <w:rPr>
+          <w:rFonts w:asciiTheme="majorBidi" w:hAnsiTheme="majorBidi" w:cstheme="majorBidi"/>
+        </w:rPr>
         <w:t>coffee_machine</w:t>
       </w:r>
       <w:proofErr w:type="spellEnd"/>
       <w:r>
+        <w:rPr>
+          <w:rFonts w:asciiTheme="majorBidi" w:hAnsiTheme="majorBidi" w:cstheme="majorBidi"/>
+        </w:rPr>
         <w:t xml:space="preserve">, </w:t>
       </w:r>
       <w:proofErr w:type="spellStart"/>
       <w:r>
+        <w:rPr>
+          <w:rFonts w:asciiTheme="majorBidi" w:hAnsiTheme="majorBidi" w:cstheme="majorBidi"/>
+        </w:rPr>
         <w:t>temperature_sensor</w:t>
       </w:r>
       <w:proofErr w:type="spellEnd"/>
       <w:r>
+        <w:rPr>
+          <w:rFonts w:asciiTheme="majorBidi" w:hAnsiTheme="majorBidi" w:cstheme="majorBidi"/>
+        </w:rPr>
         <w:t xml:space="preserve">, </w:t>
       </w:r>
       <w:proofErr w:type="spellStart"/>
       <w:r>
+        <w:rPr>
+          <w:rFonts w:asciiTheme="majorBidi" w:hAnsiTheme="majorBidi" w:cstheme="majorBidi"/>
+        </w:rPr>
         <w:t>motion_sensor</w:t>
       </w:r>
       <w:proofErr w:type="spellEnd"/>
       <w:r>
+        <w:rPr>
+          <w:rFonts w:asciiTheme="majorBidi" w:hAnsiTheme="majorBidi" w:cstheme="majorBidi"/>
+        </w:rPr>
         <w:t>, alarm, and window. Each device shall have a unique ID, name, state, and authentication secret.</w:t>
       </w:r>
     </w:p>
-    <w:p/>
-    <w:p/>
-    <w:p/>
+    <w:p>
+      <w:pPr>
+        <w:rPr>
+          <w:rFonts w:asciiTheme="majorBidi" w:hAnsiTheme="majorBidi" w:cstheme="majorBidi"/>
+        </w:rPr>
+      </w:pPr>
+    </w:p>
+    <w:p>
+      <w:pPr>
+        <w:rPr>
+          <w:rFonts w:asciiTheme="majorBidi" w:hAnsiTheme="majorBidi" w:cstheme="majorBidi"/>
+        </w:rPr>
+      </w:pPr>
+    </w:p>
+    <w:p>
+      <w:pPr>
+        <w:rPr>
+          <w:rFonts w:asciiTheme="majorBidi" w:hAnsiTheme="majorBidi" w:cstheme="majorBidi"/>
+        </w:rPr>
+      </w:pPr>
+    </w:p>
     <w:p>
       <w:pPr>
         <w:jc w:val="center"/>
+        <w:rPr>
+          <w:rFonts w:asciiTheme="majorBidi" w:hAnsiTheme="majorBidi" w:cstheme="majorBidi"/>
+        </w:rPr>
       </w:pPr>
     </w:p>
     <w:sectPr>

</xml_diff>

<commit_message>
Adjust logo position in IoT documents
</commit_message>
<xml_diff>
--- a/iot/artifacts/meeting1/Requirements.docx
+++ b/iot/artifacts/meeting1/Requirements.docx
@@ -17,18 +17,18 @@
           <w:noProof/>
         </w:rPr>
         <w:drawing>
-          <wp:anchor distT="0" distB="0" distL="114300" distR="114300" simplePos="0" relativeHeight="251658240" behindDoc="0" locked="0" layoutInCell="1" allowOverlap="1" wp14:anchorId="77B68F11" wp14:editId="7ECB1B67">
+          <wp:anchor distT="0" distB="0" distL="114300" distR="114300" simplePos="0" relativeHeight="251658240" behindDoc="0" locked="0" layoutInCell="1" allowOverlap="1" wp14:anchorId="5D8AC19D" wp14:editId="51B25817">
             <wp:simplePos x="0" y="0"/>
             <wp:positionH relativeFrom="column">
-              <wp:posOffset>5628005</wp:posOffset>
+              <wp:posOffset>5634355</wp:posOffset>
             </wp:positionH>
             <wp:positionV relativeFrom="paragraph">
-              <wp:posOffset>-893445</wp:posOffset>
+              <wp:posOffset>167005</wp:posOffset>
             </wp:positionV>
-            <wp:extent cx="1004400" cy="1004400"/>
-            <wp:effectExtent l="0" t="0" r="5715" b="5715"/>
+            <wp:extent cx="748800" cy="910800"/>
+            <wp:effectExtent l="0" t="0" r="0" b="3810"/>
             <wp:wrapNone/>
-            <wp:docPr id="1364721233" name="Bildobjekt 1"/>
+            <wp:docPr id="305650854" name="Bildobjekt 1"/>
             <wp:cNvGraphicFramePr>
               <a:graphicFrameLocks xmlns:a="http://schemas.openxmlformats.org/drawingml/2006/main" noChangeAspect="1"/>
             </wp:cNvGraphicFramePr>
@@ -36,7 +36,7 @@
               <a:graphicData uri="http://schemas.openxmlformats.org/drawingml/2006/picture">
                 <pic:pic xmlns:pic="http://schemas.openxmlformats.org/drawingml/2006/picture">
                   <pic:nvPicPr>
-                    <pic:cNvPr id="1364721233" name="Bildobjekt 1"/>
+                    <pic:cNvPr id="305650854" name="Bildobjekt 1"/>
                     <pic:cNvPicPr>
                       <a:picLocks noChangeAspect="1"/>
                     </pic:cNvPicPr>
@@ -57,7 +57,7 @@
                   <pic:spPr bwMode="auto">
                     <a:xfrm>
                       <a:off x="0" y="0"/>
-                      <a:ext cx="1004400" cy="1004400"/>
+                      <a:ext cx="748800" cy="910800"/>
                     </a:xfrm>
                     <a:prstGeom prst="rect">
                       <a:avLst/>
@@ -4990,28 +4990,28 @@
 </file>
 
 <file path=customXml/item1.xml><?xml version="1.0" encoding="utf-8"?>
-<b:Sources xmlns:b="http://schemas.openxmlformats.org/officeDocument/2006/bibliography" xmlns="http://schemas.openxmlformats.org/officeDocument/2006/bibliography" SelectedStyle="\APASixthEditionOfficeOnline.xsl" StyleName="APA" Version="6"/>
-</file>
-
-<file path=customXml/item2.xml><?xml version="1.0" encoding="utf-8"?>
 <go:gDocsCustomXmlDataStorage xmlns:go="http://customooxmlschemas.google.com/" xmlns:r="http://schemas.openxmlformats.org/officeDocument/2006/relationships" uri="GoogleDocsCustomDataVersion2">
   <go:docsCustomData xmlns:go="http://customooxmlschemas.google.com/" roundtripDataSignature="AMtx7miKRtfVLzTXqRrkG0x2WD1bh6MYDg==">CgMxLjAaEgoBMBINCgsIB0IHEgVDYXJkbxoSCgExEg0KCwgHQgcSBUNhcmRvMg5oLm53ZTFveDZieWxwNDIOaC5ia3RkajBtbGExMnIyDmguMnlwMmk1OGprcDE0Mg5oLml1YTc4c3NvNWVjcjIOaC4zMXMydnZwa2Q4MTcyDmgudjhzdmlkY293a25sMg5oLmt0OTRqMnl2NHo1eDIOaC52OXpiaHhpYWJ0ajMyDmguM3VteGttajc3cThkMg5oLmVldWc4endyYWNhdTIOaC41aTA1MHRpOXVjejcyDmgucDljbzd0Y3Q1NnJuMg5oLmFqMzVqNmZqaXJkMTgAciExU2hxbVc1VEM3Q0FxNWI5OS1TMVJxVlFwQ3JSQWNDXzM=</go:docsCustomData>
 </go:gDocsCustomXmlDataStorage>
 </file>
 
-<file path=customXml/itemProps1.xml><?xml version="1.0" encoding="utf-8"?>
-<ds:datastoreItem xmlns:ds="http://schemas.openxmlformats.org/officeDocument/2006/customXml" ds:itemID="{3E42A137-3F8C-4DFF-9B7A-DB5915123F27}">
-  <ds:schemaRefs>
-    <ds:schemaRef ds:uri="http://schemas.openxmlformats.org/officeDocument/2006/bibliography"/>
-  </ds:schemaRefs>
-</ds:datastoreItem>
+<file path=customXml/item2.xml><?xml version="1.0" encoding="utf-8"?>
+<b:Sources xmlns:b="http://schemas.openxmlformats.org/officeDocument/2006/bibliography" xmlns="http://schemas.openxmlformats.org/officeDocument/2006/bibliography" SelectedStyle="\APASixthEditionOfficeOnline.xsl" StyleName="APA" Version="6"/>
 </file>
 
-<file path=customXml/itemProps2.xml><?xml version="1.0" encoding="utf-8"?>
+<file path=customXml/itemProps1.xml><?xml version="1.0" encoding="utf-8"?>
 <ds:datastoreItem xmlns:ds="http://schemas.openxmlformats.org/officeDocument/2006/customXml" ds:itemID="{11111111-1234-1234-1234-123412341234}">
   <ds:schemaRefs>
     <ds:schemaRef ds:uri="http://customooxmlschemas.google.com/"/>
     <ds:schemaRef ds:uri="http://schemas.openxmlformats.org/officeDocument/2006/relationships"/>
   </ds:schemaRefs>
 </ds:datastoreItem>
+</file>
+
+<file path=customXml/itemProps2.xml><?xml version="1.0" encoding="utf-8"?>
+<ds:datastoreItem xmlns:ds="http://schemas.openxmlformats.org/officeDocument/2006/customXml" ds:itemID="{3E42A137-3F8C-4DFF-9B7A-DB5915123F27}">
+  <ds:schemaRefs>
+    <ds:schemaRef ds:uri="http://schemas.openxmlformats.org/officeDocument/2006/bibliography"/>
+  </ds:schemaRefs>
+</ds:datastoreItem>
 </file>
</xml_diff>